<commit_message>
docs(user-guide): chèn 14 ảnh chụp màn hình thật + fix RBAC public-route bug
- USER_GUIDE_v1.6.docx: embed 14 real screenshots (login nhân viên/cư dân,
  dashboard, cổng cư dân, hóa đơn, phản ánh, tiện ích, xe, bảo hành, thi công,
  tài khoản cư dân + ma trận phân quyền RESIDENT read-only)
- FIX: authenticateToken không còn 401 khi thiếu token (cho phép route public)
- FIX: autoRbac skip khi không có user/resident (route public đi qua)
- FIX: mount residentRoutes (chứa /resident-accounts) vào server.js — trước đó
  Tài khoản cư dân bị 'Cannot GET' (trang quản lý tài khoản cư dân không load đc)
- scripts: screenshot-* để tái tạo ảnh minh họa
</commit_message>
<xml_diff>
--- a/USER_GUIDE_v1.6.docx
+++ b/USER_GUIDE_v1.6.docx
@@ -537,6 +537,110 @@
       </w:r>
     </w:p>
     <w:p>
+      <w:pPr>
+        <w:jc w:val="center"/>
+      </w:pPr>
+      <w:r>
+        <w:drawing>
+          <wp:inline xmlns:a="http://schemas.openxmlformats.org/drawingml/2006/main" xmlns:pic="http://schemas.openxmlformats.org/drawingml/2006/picture">
+            <wp:extent cx="4754880" cy="3169920"/>
+            <wp:docPr id="1" name="Picture 1"/>
+            <wp:cNvGraphicFramePr>
+              <a:graphicFrameLocks noChangeAspect="1"/>
+            </wp:cNvGraphicFramePr>
+            <a:graphic>
+              <a:graphicData uri="http://schemas.openxmlformats.org/drawingml/2006/picture">
+                <pic:pic>
+                  <pic:nvPicPr>
+                    <pic:cNvPr id="0" name="10-admin-login.png"/>
+                    <pic:cNvPicPr/>
+                  </pic:nvPicPr>
+                  <pic:blipFill>
+                    <a:blip r:embed="rId9"/>
+                    <a:stretch>
+                      <a:fillRect/>
+                    </a:stretch>
+                  </pic:blipFill>
+                  <pic:spPr>
+                    <a:xfrm>
+                      <a:off x="0" y="0"/>
+                      <a:ext cx="4754880" cy="3169920"/>
+                    </a:xfrm>
+                    <a:prstGeom prst="rect"/>
+                  </pic:spPr>
+                </pic:pic>
+              </a:graphicData>
+            </a:graphic>
+          </wp:inline>
+        </w:drawing>
+      </w:r>
+    </w:p>
+    <w:p>
+      <w:pPr>
+        <w:jc w:val="center"/>
+      </w:pPr>
+      <w:r>
+        <w:rPr>
+          <w:i/>
+          <w:color w:val="5A6960"/>
+          <w:sz w:val="17"/>
+        </w:rPr>
+        <w:t>Hình 1.1 — Màn hình Đăng nhập quản trị (nhân viên nội bộ)</w:t>
+      </w:r>
+    </w:p>
+    <w:p>
+      <w:pPr>
+        <w:jc w:val="center"/>
+      </w:pPr>
+      <w:r>
+        <w:drawing>
+          <wp:inline xmlns:a="http://schemas.openxmlformats.org/drawingml/2006/main" xmlns:pic="http://schemas.openxmlformats.org/drawingml/2006/picture">
+            <wp:extent cx="4754880" cy="3169920"/>
+            <wp:docPr id="2" name="Picture 2"/>
+            <wp:cNvGraphicFramePr>
+              <a:graphicFrameLocks noChangeAspect="1"/>
+            </wp:cNvGraphicFramePr>
+            <a:graphic>
+              <a:graphicData uri="http://schemas.openxmlformats.org/drawingml/2006/picture">
+                <pic:pic>
+                  <pic:nvPicPr>
+                    <pic:cNvPr id="0" name="01-resident-login.png"/>
+                    <pic:cNvPicPr/>
+                  </pic:nvPicPr>
+                  <pic:blipFill>
+                    <a:blip r:embed="rId10"/>
+                    <a:stretch>
+                      <a:fillRect/>
+                    </a:stretch>
+                  </pic:blipFill>
+                  <pic:spPr>
+                    <a:xfrm>
+                      <a:off x="0" y="0"/>
+                      <a:ext cx="4754880" cy="3169920"/>
+                    </a:xfrm>
+                    <a:prstGeom prst="rect"/>
+                  </pic:spPr>
+                </pic:pic>
+              </a:graphicData>
+            </a:graphic>
+          </wp:inline>
+        </w:drawing>
+      </w:r>
+    </w:p>
+    <w:p>
+      <w:pPr>
+        <w:jc w:val="center"/>
+      </w:pPr>
+      <w:r>
+        <w:rPr>
+          <w:i/>
+          <w:color w:val="5A6960"/>
+          <w:sz w:val="17"/>
+        </w:rPr>
+        <w:t>Hình 1.2 — Màn hình Đăng nhập Cổng thông tin cư dân (SĐT + mật khẩu)</w:t>
+      </w:r>
+    </w:p>
+    <w:p>
       <w:r>
         <w:br w:type="page"/>
       </w:r>
@@ -1718,13 +1822,234 @@
     </w:p>
     <w:p>
       <w:pPr>
-        <w:pStyle w:val="Heading2"/>
+        <w:jc w:val="center"/>
+      </w:pPr>
+      <w:r>
+        <w:drawing>
+          <wp:inline xmlns:a="http://schemas.openxmlformats.org/drawingml/2006/main" xmlns:pic="http://schemas.openxmlformats.org/drawingml/2006/picture">
+            <wp:extent cx="5486400" cy="3657600"/>
+            <wp:docPr id="3" name="Picture 3"/>
+            <wp:cNvGraphicFramePr>
+              <a:graphicFrameLocks noChangeAspect="1"/>
+            </wp:cNvGraphicFramePr>
+            <a:graphic>
+              <a:graphicData uri="http://schemas.openxmlformats.org/drawingml/2006/picture">
+                <pic:pic>
+                  <pic:nvPicPr>
+                    <pic:cNvPr id="0" name="11-admin-dashboard.png"/>
+                    <pic:cNvPicPr/>
+                  </pic:nvPicPr>
+                  <pic:blipFill>
+                    <a:blip r:embed="rId11"/>
+                    <a:stretch>
+                      <a:fillRect/>
+                    </a:stretch>
+                  </pic:blipFill>
+                  <pic:spPr>
+                    <a:xfrm>
+                      <a:off x="0" y="0"/>
+                      <a:ext cx="5486400" cy="3657600"/>
+                    </a:xfrm>
+                    <a:prstGeom prst="rect"/>
+                  </pic:spPr>
+                </pic:pic>
+              </a:graphicData>
+            </a:graphic>
+          </wp:inline>
+        </w:drawing>
+      </w:r>
+    </w:p>
+    <w:p>
+      <w:pPr>
+        <w:jc w:val="center"/>
+      </w:pPr>
+      <w:r>
+        <w:rPr>
+          <w:i/>
+          <w:color w:val="5A6960"/>
+          <w:sz w:val="17"/>
+        </w:rPr>
+        <w:t>Hình 3.1 — Bảng điều khiển (Tổng quan) của nhân viên nội bộ sau đăng nhập</w:t>
+      </w:r>
+    </w:p>
+    <w:p>
+      <w:pPr>
+        <w:jc w:val="center"/>
+      </w:pPr>
+      <w:r>
+        <w:drawing>
+          <wp:inline xmlns:a="http://schemas.openxmlformats.org/drawingml/2006/main" xmlns:pic="http://schemas.openxmlformats.org/drawingml/2006/picture">
+            <wp:extent cx="5486400" cy="3657600"/>
+            <wp:docPr id="4" name="Picture 4"/>
+            <wp:cNvGraphicFramePr>
+              <a:graphicFrameLocks noChangeAspect="1"/>
+            </wp:cNvGraphicFramePr>
+            <a:graphic>
+              <a:graphicData uri="http://schemas.openxmlformats.org/drawingml/2006/picture">
+                <pic:pic>
+                  <pic:nvPicPr>
+                    <pic:cNvPr id="0" name="12-admin-Cuhnh.png"/>
+                    <pic:cNvPicPr/>
+                  </pic:nvPicPr>
+                  <pic:blipFill>
+                    <a:blip r:embed="rId12"/>
+                    <a:stretch>
+                      <a:fillRect/>
+                    </a:stretch>
+                  </pic:blipFill>
+                  <pic:spPr>
+                    <a:xfrm>
+                      <a:off x="0" y="0"/>
+                      <a:ext cx="5486400" cy="3657600"/>
+                    </a:xfrm>
+                    <a:prstGeom prst="rect"/>
+                  </pic:spPr>
+                </pic:pic>
+              </a:graphicData>
+            </a:graphic>
+          </wp:inline>
+        </w:drawing>
+      </w:r>
+    </w:p>
+    <w:p>
+      <w:pPr>
+        <w:jc w:val="center"/>
+      </w:pPr>
+      <w:r>
+        <w:rPr>
+          <w:i/>
+          <w:color w:val="5A6960"/>
+          <w:sz w:val="17"/>
+        </w:rPr>
+        <w:t>Hình 3.2 — Màn hình Cấu hình hệ thống (biểu phí, email, HĐĐT, AI...)</w:t>
+      </w:r>
+    </w:p>
+    <w:p>
+      <w:pPr>
+        <w:pStyle w:val="Heading3"/>
       </w:pPr>
       <w:r>
         <w:rPr>
           <w:color w:val="17231F"/>
         </w:rPr>
-        <w:t>3.2. Kinh doanh (DIR / SM / SHEAD / SALE / AGENT / CS / ACC-S / LAW)</w:t>
+        <w:t>3.1.1. Quản lý tài khoản cư dân &amp; xem phân quyền</w:t>
+      </w:r>
+    </w:p>
+    <w:p>
+      <w:pPr>
+        <w:spacing w:after="120"/>
+      </w:pPr>
+      <w:r>
+        <w:rPr>
+          <w:b w:val="0"/>
+          <w:i w:val="0"/>
+          <w:sz w:val="21"/>
+        </w:rPr>
+        <w:t>Tại menu "Tài khoản cư dân", Ban quản lý xem danh sách tài khoản, có thể "Reset mật khẩu" và xem ma trận phân quyền của từng tài khoản (chỉ đọc, theo vai trò RESIDENT).</w:t>
+      </w:r>
+    </w:p>
+    <w:p>
+      <w:pPr>
+        <w:jc w:val="center"/>
+      </w:pPr>
+      <w:r>
+        <w:drawing>
+          <wp:inline xmlns:a="http://schemas.openxmlformats.org/drawingml/2006/main" xmlns:pic="http://schemas.openxmlformats.org/drawingml/2006/picture">
+            <wp:extent cx="5486400" cy="3657600"/>
+            <wp:docPr id="5" name="Picture 5"/>
+            <wp:cNvGraphicFramePr>
+              <a:graphicFrameLocks noChangeAspect="1"/>
+            </wp:cNvGraphicFramePr>
+            <a:graphic>
+              <a:graphicData uri="http://schemas.openxmlformats.org/drawingml/2006/picture">
+                <pic:pic>
+                  <pic:nvPicPr>
+                    <pic:cNvPr id="0" name="14-admin-taikhoan-cudan.png"/>
+                    <pic:cNvPicPr/>
+                  </pic:nvPicPr>
+                  <pic:blipFill>
+                    <a:blip r:embed="rId13"/>
+                    <a:stretch>
+                      <a:fillRect/>
+                    </a:stretch>
+                  </pic:blipFill>
+                  <pic:spPr>
+                    <a:xfrm>
+                      <a:off x="0" y="0"/>
+                      <a:ext cx="5486400" cy="3657600"/>
+                    </a:xfrm>
+                    <a:prstGeom prst="rect"/>
+                  </pic:spPr>
+                </pic:pic>
+              </a:graphicData>
+            </a:graphic>
+          </wp:inline>
+        </w:drawing>
+      </w:r>
+    </w:p>
+    <w:p>
+      <w:pPr>
+        <w:jc w:val="center"/>
+      </w:pPr>
+      <w:r>
+        <w:rPr>
+          <w:i/>
+          <w:color w:val="5A6960"/>
+          <w:sz w:val="17"/>
+        </w:rPr>
+        <w:t>Hình 3.3 — Danh sách Tài khoản cư dân (admin)</w:t>
+      </w:r>
+    </w:p>
+    <w:p>
+      <w:pPr>
+        <w:jc w:val="center"/>
+      </w:pPr>
+      <w:r>
+        <w:drawing>
+          <wp:inline xmlns:a="http://schemas.openxmlformats.org/drawingml/2006/main" xmlns:pic="http://schemas.openxmlformats.org/drawingml/2006/picture">
+            <wp:extent cx="4937760" cy="3291840"/>
+            <wp:docPr id="6" name="Picture 6"/>
+            <wp:cNvGraphicFramePr>
+              <a:graphicFrameLocks noChangeAspect="1"/>
+            </wp:cNvGraphicFramePr>
+            <a:graphic>
+              <a:graphicData uri="http://schemas.openxmlformats.org/drawingml/2006/picture">
+                <pic:pic>
+                  <pic:nvPicPr>
+                    <pic:cNvPr id="0" name="15-admin-permission-matrix.png"/>
+                    <pic:cNvPicPr/>
+                  </pic:nvPicPr>
+                  <pic:blipFill>
+                    <a:blip r:embed="rId14"/>
+                    <a:stretch>
+                      <a:fillRect/>
+                    </a:stretch>
+                  </pic:blipFill>
+                  <pic:spPr>
+                    <a:xfrm>
+                      <a:off x="0" y="0"/>
+                      <a:ext cx="4937760" cy="3291840"/>
+                    </a:xfrm>
+                    <a:prstGeom prst="rect"/>
+                  </pic:spPr>
+                </pic:pic>
+              </a:graphicData>
+            </a:graphic>
+          </wp:inline>
+        </w:drawing>
+      </w:r>
+    </w:p>
+    <w:p>
+      <w:pPr>
+        <w:jc w:val="center"/>
+      </w:pPr>
+      <w:r>
+        <w:rPr>
+          <w:i/>
+          <w:color w:val="5A6960"/>
+          <w:sz w:val="17"/>
+        </w:rPr>
+        <w:t>Hình 3.4 — Ma trận phân quyền tài khoản cư dân (read-only, vai trò RESIDENT)</w:t>
       </w:r>
     </w:p>
     <w:p>
@@ -1932,6 +2257,110 @@
     </w:p>
     <w:p>
       <w:pPr>
+        <w:jc w:val="center"/>
+      </w:pPr>
+      <w:r>
+        <w:drawing>
+          <wp:inline xmlns:a="http://schemas.openxmlformats.org/drawingml/2006/main" xmlns:pic="http://schemas.openxmlformats.org/drawingml/2006/picture">
+            <wp:extent cx="4754880" cy="3169920"/>
+            <wp:docPr id="7" name="Picture 7"/>
+            <wp:cNvGraphicFramePr>
+              <a:graphicFrameLocks noChangeAspect="1"/>
+            </wp:cNvGraphicFramePr>
+            <a:graphic>
+              <a:graphicData uri="http://schemas.openxmlformats.org/drawingml/2006/picture">
+                <pic:pic>
+                  <pic:nvPicPr>
+                    <pic:cNvPr id="0" name="02-resident-portal-onboard.png"/>
+                    <pic:cNvPicPr/>
+                  </pic:nvPicPr>
+                  <pic:blipFill>
+                    <a:blip r:embed="rId15"/>
+                    <a:stretch>
+                      <a:fillRect/>
+                    </a:stretch>
+                  </pic:blipFill>
+                  <pic:spPr>
+                    <a:xfrm>
+                      <a:off x="0" y="0"/>
+                      <a:ext cx="4754880" cy="3169920"/>
+                    </a:xfrm>
+                    <a:prstGeom prst="rect"/>
+                  </pic:spPr>
+                </pic:pic>
+              </a:graphicData>
+            </a:graphic>
+          </wp:inline>
+        </w:drawing>
+      </w:r>
+    </w:p>
+    <w:p>
+      <w:pPr>
+        <w:jc w:val="center"/>
+      </w:pPr>
+      <w:r>
+        <w:rPr>
+          <w:i/>
+          <w:color w:val="5A6960"/>
+          <w:sz w:val="17"/>
+        </w:rPr>
+        <w:t>Hình 4.1 — Wizard chào mừng &amp; chọn căn hộ khi đăng nhập cư dân lần đầu</w:t>
+      </w:r>
+    </w:p>
+    <w:p>
+      <w:pPr>
+        <w:jc w:val="center"/>
+      </w:pPr>
+      <w:r>
+        <w:drawing>
+          <wp:inline xmlns:a="http://schemas.openxmlformats.org/drawingml/2006/main" xmlns:pic="http://schemas.openxmlformats.org/drawingml/2006/picture">
+            <wp:extent cx="5486400" cy="3657600"/>
+            <wp:docPr id="8" name="Picture 8"/>
+            <wp:cNvGraphicFramePr>
+              <a:graphicFrameLocks noChangeAspect="1"/>
+            </wp:cNvGraphicFramePr>
+            <a:graphic>
+              <a:graphicData uri="http://schemas.openxmlformats.org/drawingml/2006/picture">
+                <pic:pic>
+                  <pic:nvPicPr>
+                    <pic:cNvPr id="0" name="03-resident-tongquan.png"/>
+                    <pic:cNvPicPr/>
+                  </pic:nvPicPr>
+                  <pic:blipFill>
+                    <a:blip r:embed="rId16"/>
+                    <a:stretch>
+                      <a:fillRect/>
+                    </a:stretch>
+                  </pic:blipFill>
+                  <pic:spPr>
+                    <a:xfrm>
+                      <a:off x="0" y="0"/>
+                      <a:ext cx="5486400" cy="3657600"/>
+                    </a:xfrm>
+                    <a:prstGeom prst="rect"/>
+                  </pic:spPr>
+                </pic:pic>
+              </a:graphicData>
+            </a:graphic>
+          </wp:inline>
+        </w:drawing>
+      </w:r>
+    </w:p>
+    <w:p>
+      <w:pPr>
+        <w:jc w:val="center"/>
+      </w:pPr>
+      <w:r>
+        <w:rPr>
+          <w:i/>
+          <w:color w:val="5A6960"/>
+          <w:sz w:val="17"/>
+        </w:rPr>
+        <w:t>Hình 4.2 — Giao diện Cổng thông tin cư dân (menu: Tin tức, Hóa đơn, Tiện ích, Phản ánh, Xe, Bảo hành, Thi công...)</w:t>
+      </w:r>
+    </w:p>
+    <w:p>
+      <w:pPr>
         <w:pStyle w:val="Heading2"/>
       </w:pPr>
       <w:r>
@@ -2497,6 +2926,318 @@
         </w:tc>
       </w:tr>
     </w:tbl>
+    <w:p>
+      <w:pPr>
+        <w:jc w:val="center"/>
+      </w:pPr>
+      <w:r>
+        <w:drawing>
+          <wp:inline xmlns:a="http://schemas.openxmlformats.org/drawingml/2006/main" xmlns:pic="http://schemas.openxmlformats.org/drawingml/2006/picture">
+            <wp:extent cx="5486400" cy="3657600"/>
+            <wp:docPr id="9" name="Picture 9"/>
+            <wp:cNvGraphicFramePr>
+              <a:graphicFrameLocks noChangeAspect="1"/>
+            </wp:cNvGraphicFramePr>
+            <a:graphic>
+              <a:graphicData uri="http://schemas.openxmlformats.org/drawingml/2006/picture">
+                <pic:pic>
+                  <pic:nvPicPr>
+                    <pic:cNvPr id="0" name="04-res-HanTngHp.png"/>
+                    <pic:cNvPicPr/>
+                  </pic:nvPicPr>
+                  <pic:blipFill>
+                    <a:blip r:embed="rId17"/>
+                    <a:stretch>
+                      <a:fillRect/>
+                    </a:stretch>
+                  </pic:blipFill>
+                  <pic:spPr>
+                    <a:xfrm>
+                      <a:off x="0" y="0"/>
+                      <a:ext cx="5486400" cy="3657600"/>
+                    </a:xfrm>
+                    <a:prstGeom prst="rect"/>
+                  </pic:spPr>
+                </pic:pic>
+              </a:graphicData>
+            </a:graphic>
+          </wp:inline>
+        </w:drawing>
+      </w:r>
+    </w:p>
+    <w:p>
+      <w:pPr>
+        <w:jc w:val="center"/>
+      </w:pPr>
+      <w:r>
+        <w:rPr>
+          <w:i/>
+          <w:color w:val="5A6960"/>
+          <w:sz w:val="17"/>
+        </w:rPr>
+        <w:t>Hình 4.3 — Hóa đơn tổng hợp căn hộ (207.000 ₫, đã thanh toán)</w:t>
+      </w:r>
+    </w:p>
+    <w:p>
+      <w:pPr>
+        <w:jc w:val="center"/>
+      </w:pPr>
+      <w:r>
+        <w:drawing>
+          <wp:inline xmlns:a="http://schemas.openxmlformats.org/drawingml/2006/main" xmlns:pic="http://schemas.openxmlformats.org/drawingml/2006/picture">
+            <wp:extent cx="5120640" cy="3413760"/>
+            <wp:docPr id="10" name="Picture 10"/>
+            <wp:cNvGraphicFramePr>
+              <a:graphicFrameLocks noChangeAspect="1"/>
+            </wp:cNvGraphicFramePr>
+            <a:graphic>
+              <a:graphicData uri="http://schemas.openxmlformats.org/drawingml/2006/picture">
+                <pic:pic>
+                  <pic:nvPicPr>
+                    <pic:cNvPr id="0" name="05-res-Phnnh.png"/>
+                    <pic:cNvPicPr/>
+                  </pic:nvPicPr>
+                  <pic:blipFill>
+                    <a:blip r:embed="rId18"/>
+                    <a:stretch>
+                      <a:fillRect/>
+                    </a:stretch>
+                  </pic:blipFill>
+                  <pic:spPr>
+                    <a:xfrm>
+                      <a:off x="0" y="0"/>
+                      <a:ext cx="5120640" cy="3413760"/>
+                    </a:xfrm>
+                    <a:prstGeom prst="rect"/>
+                  </pic:spPr>
+                </pic:pic>
+              </a:graphicData>
+            </a:graphic>
+          </wp:inline>
+        </w:drawing>
+      </w:r>
+    </w:p>
+    <w:p>
+      <w:pPr>
+        <w:jc w:val="center"/>
+      </w:pPr>
+      <w:r>
+        <w:rPr>
+          <w:i/>
+          <w:color w:val="5A6960"/>
+          <w:sz w:val="17"/>
+        </w:rPr>
+        <w:t>Hình 4.4 — Gửi phản ánh (feedback)</w:t>
+      </w:r>
+    </w:p>
+    <w:p>
+      <w:pPr>
+        <w:jc w:val="center"/>
+      </w:pPr>
+      <w:r>
+        <w:drawing>
+          <wp:inline xmlns:a="http://schemas.openxmlformats.org/drawingml/2006/main" xmlns:pic="http://schemas.openxmlformats.org/drawingml/2006/picture">
+            <wp:extent cx="5120640" cy="3413760"/>
+            <wp:docPr id="11" name="Picture 11"/>
+            <wp:cNvGraphicFramePr>
+              <a:graphicFrameLocks noChangeAspect="1"/>
+            </wp:cNvGraphicFramePr>
+            <a:graphic>
+              <a:graphicData uri="http://schemas.openxmlformats.org/drawingml/2006/picture">
+                <pic:pic>
+                  <pic:nvPicPr>
+                    <pic:cNvPr id="0" name="05-res-ngKTinch.png"/>
+                    <pic:cNvPicPr/>
+                  </pic:nvPicPr>
+                  <pic:blipFill>
+                    <a:blip r:embed="rId19"/>
+                    <a:stretch>
+                      <a:fillRect/>
+                    </a:stretch>
+                  </pic:blipFill>
+                  <pic:spPr>
+                    <a:xfrm>
+                      <a:off x="0" y="0"/>
+                      <a:ext cx="5120640" cy="3413760"/>
+                    </a:xfrm>
+                    <a:prstGeom prst="rect"/>
+                  </pic:spPr>
+                </pic:pic>
+              </a:graphicData>
+            </a:graphic>
+          </wp:inline>
+        </w:drawing>
+      </w:r>
+    </w:p>
+    <w:p>
+      <w:pPr>
+        <w:jc w:val="center"/>
+      </w:pPr>
+      <w:r>
+        <w:rPr>
+          <w:i/>
+          <w:color w:val="5A6960"/>
+          <w:sz w:val="17"/>
+        </w:rPr>
+        <w:t>Hình 4.5 — Đăng ký tiện ích chung</w:t>
+      </w:r>
+    </w:p>
+    <w:p>
+      <w:pPr>
+        <w:jc w:val="center"/>
+      </w:pPr>
+      <w:r>
+        <w:drawing>
+          <wp:inline xmlns:a="http://schemas.openxmlformats.org/drawingml/2006/main" xmlns:pic="http://schemas.openxmlformats.org/drawingml/2006/picture">
+            <wp:extent cx="5120640" cy="3413760"/>
+            <wp:docPr id="12" name="Picture 12"/>
+            <wp:cNvGraphicFramePr>
+              <a:graphicFrameLocks noChangeAspect="1"/>
+            </wp:cNvGraphicFramePr>
+            <a:graphic>
+              <a:graphicData uri="http://schemas.openxmlformats.org/drawingml/2006/picture">
+                <pic:pic>
+                  <pic:nvPicPr>
+                    <pic:cNvPr id="0" name="05-res-ThXePhngTin.png"/>
+                    <pic:cNvPicPr/>
+                  </pic:nvPicPr>
+                  <pic:blipFill>
+                    <a:blip r:embed="rId20"/>
+                    <a:stretch>
+                      <a:fillRect/>
+                    </a:stretch>
+                  </pic:blipFill>
+                  <pic:spPr>
+                    <a:xfrm>
+                      <a:off x="0" y="0"/>
+                      <a:ext cx="5120640" cy="3413760"/>
+                    </a:xfrm>
+                    <a:prstGeom prst="rect"/>
+                  </pic:spPr>
+                </pic:pic>
+              </a:graphicData>
+            </a:graphic>
+          </wp:inline>
+        </w:drawing>
+      </w:r>
+    </w:p>
+    <w:p>
+      <w:pPr>
+        <w:jc w:val="center"/>
+      </w:pPr>
+      <w:r>
+        <w:rPr>
+          <w:i/>
+          <w:color w:val="5A6960"/>
+          <w:sz w:val="17"/>
+        </w:rPr>
+        <w:t>Hình 4.6 — Thẻ xe / phương tiện</w:t>
+      </w:r>
+    </w:p>
+    <w:p>
+      <w:pPr>
+        <w:jc w:val="center"/>
+      </w:pPr>
+      <w:r>
+        <w:drawing>
+          <wp:inline xmlns:a="http://schemas.openxmlformats.org/drawingml/2006/main" xmlns:pic="http://schemas.openxmlformats.org/drawingml/2006/picture">
+            <wp:extent cx="5120640" cy="3413760"/>
+            <wp:docPr id="13" name="Picture 13"/>
+            <wp:cNvGraphicFramePr>
+              <a:graphicFrameLocks noChangeAspect="1"/>
+            </wp:cNvGraphicFramePr>
+            <a:graphic>
+              <a:graphicData uri="http://schemas.openxmlformats.org/drawingml/2006/picture">
+                <pic:pic>
+                  <pic:nvPicPr>
+                    <pic:cNvPr id="0" name="05-res-BoHnhCnH.png"/>
+                    <pic:cNvPicPr/>
+                  </pic:nvPicPr>
+                  <pic:blipFill>
+                    <a:blip r:embed="rId21"/>
+                    <a:stretch>
+                      <a:fillRect/>
+                    </a:stretch>
+                  </pic:blipFill>
+                  <pic:spPr>
+                    <a:xfrm>
+                      <a:off x="0" y="0"/>
+                      <a:ext cx="5120640" cy="3413760"/>
+                    </a:xfrm>
+                    <a:prstGeom prst="rect"/>
+                  </pic:spPr>
+                </pic:pic>
+              </a:graphicData>
+            </a:graphic>
+          </wp:inline>
+        </w:drawing>
+      </w:r>
+    </w:p>
+    <w:p>
+      <w:pPr>
+        <w:jc w:val="center"/>
+      </w:pPr>
+      <w:r>
+        <w:rPr>
+          <w:i/>
+          <w:color w:val="5A6960"/>
+          <w:sz w:val="17"/>
+        </w:rPr>
+        <w:t>Hình 4.7 — Bảo hành căn hộ</w:t>
+      </w:r>
+    </w:p>
+    <w:p>
+      <w:pPr>
+        <w:jc w:val="center"/>
+      </w:pPr>
+      <w:r>
+        <w:drawing>
+          <wp:inline xmlns:a="http://schemas.openxmlformats.org/drawingml/2006/main" xmlns:pic="http://schemas.openxmlformats.org/drawingml/2006/picture">
+            <wp:extent cx="5120640" cy="3413760"/>
+            <wp:docPr id="14" name="Picture 14"/>
+            <wp:cNvGraphicFramePr>
+              <a:graphicFrameLocks noChangeAspect="1"/>
+            </wp:cNvGraphicFramePr>
+            <a:graphic>
+              <a:graphicData uri="http://schemas.openxmlformats.org/drawingml/2006/picture">
+                <pic:pic>
+                  <pic:nvPicPr>
+                    <pic:cNvPr id="0" name="05-res-ngKCiTo.png"/>
+                    <pic:cNvPicPr/>
+                  </pic:nvPicPr>
+                  <pic:blipFill>
+                    <a:blip r:embed="rId22"/>
+                    <a:stretch>
+                      <a:fillRect/>
+                    </a:stretch>
+                  </pic:blipFill>
+                  <pic:spPr>
+                    <a:xfrm>
+                      <a:off x="0" y="0"/>
+                      <a:ext cx="5120640" cy="3413760"/>
+                    </a:xfrm>
+                    <a:prstGeom prst="rect"/>
+                  </pic:spPr>
+                </pic:pic>
+              </a:graphicData>
+            </a:graphic>
+          </wp:inline>
+        </w:drawing>
+      </w:r>
+    </w:p>
+    <w:p>
+      <w:pPr>
+        <w:jc w:val="center"/>
+      </w:pPr>
+      <w:r>
+        <w:rPr>
+          <w:i/>
+          <w:color w:val="5A6960"/>
+          <w:sz w:val="17"/>
+        </w:rPr>
+        <w:t>Hình 4.8 — Đăng ký cải tạo thi công</w:t>
+      </w:r>
+    </w:p>
     <w:p>
       <w:pPr>
         <w:pStyle w:val="Heading2"/>

</xml_diff>

<commit_message>
docs(user-guide): chèn 9 ảnh chụp màn hình quản trị thật (admin/password)
- Thêm 9 ảnh admin: dashboard tổng quan, Căn Hộ, Cư Dân, Phản Ánh, Tiện ích,
  Bảo hành, Điện nước, Hóa đơn tổng hợp, CRM (doanh thu 7.9 tỷ ₫)
- USER_GUIDE_v1.6.docx: 23 ảnh minh họa (tăng từ 14), 3.78 MB
- scripts/screenshot-admin.mjs: tái tạo ảnh quản trị
</commit_message>
<xml_diff>
--- a/USER_GUIDE_v1.6.docx
+++ b/USER_GUIDE_v1.6.docx
@@ -2062,6 +2062,58 @@
     </w:p>
     <w:p>
       <w:pPr>
+        <w:jc w:val="center"/>
+      </w:pPr>
+      <w:r>
+        <w:drawing>
+          <wp:inline xmlns:a="http://schemas.openxmlformats.org/drawingml/2006/main" xmlns:pic="http://schemas.openxmlformats.org/drawingml/2006/picture">
+            <wp:extent cx="5486400" cy="3657600"/>
+            <wp:docPr id="7" name="Picture 7"/>
+            <wp:cNvGraphicFramePr>
+              <a:graphicFrameLocks noChangeAspect="1"/>
+            </wp:cNvGraphicFramePr>
+            <a:graphic>
+              <a:graphicData uri="http://schemas.openxmlformats.org/drawingml/2006/picture">
+                <pic:pic>
+                  <pic:nvPicPr>
+                    <pic:cNvPr id="0" name="20-admin-dashboard.png"/>
+                    <pic:cNvPicPr/>
+                  </pic:nvPicPr>
+                  <pic:blipFill>
+                    <a:blip r:embed="rId15"/>
+                    <a:stretch>
+                      <a:fillRect/>
+                    </a:stretch>
+                  </pic:blipFill>
+                  <pic:spPr>
+                    <a:xfrm>
+                      <a:off x="0" y="0"/>
+                      <a:ext cx="5486400" cy="3657600"/>
+                    </a:xfrm>
+                    <a:prstGeom prst="rect"/>
+                  </pic:spPr>
+                </pic:pic>
+              </a:graphicData>
+            </a:graphic>
+          </wp:inline>
+        </w:drawing>
+      </w:r>
+    </w:p>
+    <w:p>
+      <w:pPr>
+        <w:jc w:val="center"/>
+      </w:pPr>
+      <w:r>
+        <w:rPr>
+          <w:i/>
+          <w:color w:val="5A6960"/>
+          <w:sz w:val="17"/>
+        </w:rPr>
+        <w:t>Hình 3.5 — Bảng điều khiển Tổng quan (admin): KPI cư dân, tỷ lệ lấp đầy, doanh thu, phản ánh</w:t>
+      </w:r>
+    </w:p>
+    <w:p>
+      <w:pPr>
         <w:pStyle w:val="ListBullet"/>
       </w:pPr>
       <w:r>
@@ -2106,6 +2158,58 @@
       </w:pPr>
       <w:r>
         <w:t>CS: Tiếp nhận tổng đài, hỗ trợ sau bán hàng, cập nhật hồ sơ khách.</w:t>
+      </w:r>
+    </w:p>
+    <w:p>
+      <w:pPr>
+        <w:jc w:val="center"/>
+      </w:pPr>
+      <w:r>
+        <w:drawing>
+          <wp:inline xmlns:a="http://schemas.openxmlformats.org/drawingml/2006/main" xmlns:pic="http://schemas.openxmlformats.org/drawingml/2006/picture">
+            <wp:extent cx="5486400" cy="3657600"/>
+            <wp:docPr id="8" name="Picture 8"/>
+            <wp:cNvGraphicFramePr>
+              <a:graphicFrameLocks noChangeAspect="1"/>
+            </wp:cNvGraphicFramePr>
+            <a:graphic>
+              <a:graphicData uri="http://schemas.openxmlformats.org/drawingml/2006/picture">
+                <pic:pic>
+                  <pic:nvPicPr>
+                    <pic:cNvPr id="0" name="21-admin-KinhDoanhCRM.png"/>
+                    <pic:cNvPicPr/>
+                  </pic:nvPicPr>
+                  <pic:blipFill>
+                    <a:blip r:embed="rId16"/>
+                    <a:stretch>
+                      <a:fillRect/>
+                    </a:stretch>
+                  </pic:blipFill>
+                  <pic:spPr>
+                    <a:xfrm>
+                      <a:off x="0" y="0"/>
+                      <a:ext cx="5486400" cy="3657600"/>
+                    </a:xfrm>
+                    <a:prstGeom prst="rect"/>
+                  </pic:spPr>
+                </pic:pic>
+              </a:graphicData>
+            </a:graphic>
+          </wp:inline>
+        </w:drawing>
+      </w:r>
+    </w:p>
+    <w:p>
+      <w:pPr>
+        <w:jc w:val="center"/>
+      </w:pPr>
+      <w:r>
+        <w:rPr>
+          <w:i/>
+          <w:color w:val="5A6960"/>
+          <w:sz w:val="17"/>
+        </w:rPr>
+        <w:t>Hình 3.6 — Phân hệ Kinh doanh (CRM): doanh thu ký kết, tồn kho, phễu chuyển đổi</w:t>
       </w:r>
     </w:p>
     <w:p>
@@ -2165,6 +2269,370 @@
       </w:pPr>
       <w:r>
         <w:t>PMO: Kế hoạch bàn giao, nghiệm thu, cầu nối sang vận hành.</w:t>
+      </w:r>
+    </w:p>
+    <w:p>
+      <w:pPr>
+        <w:jc w:val="center"/>
+      </w:pPr>
+      <w:r>
+        <w:drawing>
+          <wp:inline xmlns:a="http://schemas.openxmlformats.org/drawingml/2006/main" xmlns:pic="http://schemas.openxmlformats.org/drawingml/2006/picture">
+            <wp:extent cx="5486400" cy="3657600"/>
+            <wp:docPr id="9" name="Picture 9"/>
+            <wp:cNvGraphicFramePr>
+              <a:graphicFrameLocks noChangeAspect="1"/>
+            </wp:cNvGraphicFramePr>
+            <a:graphic>
+              <a:graphicData uri="http://schemas.openxmlformats.org/drawingml/2006/picture">
+                <pic:pic>
+                  <pic:nvPicPr>
+                    <pic:cNvPr id="0" name="21-admin-CnH.png"/>
+                    <pic:cNvPicPr/>
+                  </pic:nvPicPr>
+                  <pic:blipFill>
+                    <a:blip r:embed="rId17"/>
+                    <a:stretch>
+                      <a:fillRect/>
+                    </a:stretch>
+                  </pic:blipFill>
+                  <pic:spPr>
+                    <a:xfrm>
+                      <a:off x="0" y="0"/>
+                      <a:ext cx="5486400" cy="3657600"/>
+                    </a:xfrm>
+                    <a:prstGeom prst="rect"/>
+                  </pic:spPr>
+                </pic:pic>
+              </a:graphicData>
+            </a:graphic>
+          </wp:inline>
+        </w:drawing>
+      </w:r>
+    </w:p>
+    <w:p>
+      <w:pPr>
+        <w:jc w:val="center"/>
+      </w:pPr>
+      <w:r>
+        <w:rPr>
+          <w:i/>
+          <w:color w:val="5A6960"/>
+          <w:sz w:val="17"/>
+        </w:rPr>
+        <w:t>Hình 3.7 — Phân hệ Vận hành: quản lý Căn hộ (117 căn, tỷ lệ lấp đầy)</w:t>
+      </w:r>
+    </w:p>
+    <w:p>
+      <w:pPr>
+        <w:jc w:val="center"/>
+      </w:pPr>
+      <w:r>
+        <w:drawing>
+          <wp:inline xmlns:a="http://schemas.openxmlformats.org/drawingml/2006/main" xmlns:pic="http://schemas.openxmlformats.org/drawingml/2006/picture">
+            <wp:extent cx="5486400" cy="3657600"/>
+            <wp:docPr id="10" name="Picture 10"/>
+            <wp:cNvGraphicFramePr>
+              <a:graphicFrameLocks noChangeAspect="1"/>
+            </wp:cNvGraphicFramePr>
+            <a:graphic>
+              <a:graphicData uri="http://schemas.openxmlformats.org/drawingml/2006/picture">
+                <pic:pic>
+                  <pic:nvPicPr>
+                    <pic:cNvPr id="0" name="21-admin-CDn.png"/>
+                    <pic:cNvPicPr/>
+                  </pic:nvPicPr>
+                  <pic:blipFill>
+                    <a:blip r:embed="rId18"/>
+                    <a:stretch>
+                      <a:fillRect/>
+                    </a:stretch>
+                  </pic:blipFill>
+                  <pic:spPr>
+                    <a:xfrm>
+                      <a:off x="0" y="0"/>
+                      <a:ext cx="5486400" cy="3657600"/>
+                    </a:xfrm>
+                    <a:prstGeom prst="rect"/>
+                  </pic:spPr>
+                </pic:pic>
+              </a:graphicData>
+            </a:graphic>
+          </wp:inline>
+        </w:drawing>
+      </w:r>
+    </w:p>
+    <w:p>
+      <w:pPr>
+        <w:jc w:val="center"/>
+      </w:pPr>
+      <w:r>
+        <w:rPr>
+          <w:i/>
+          <w:color w:val="5A6960"/>
+          <w:sz w:val="17"/>
+        </w:rPr>
+        <w:t>Hình 3.8 — Quản lý Cư dân (hồ sơ, quan hệ căn hộ)</w:t>
+      </w:r>
+    </w:p>
+    <w:p>
+      <w:pPr>
+        <w:jc w:val="center"/>
+      </w:pPr>
+      <w:r>
+        <w:drawing>
+          <wp:inline xmlns:a="http://schemas.openxmlformats.org/drawingml/2006/main" xmlns:pic="http://schemas.openxmlformats.org/drawingml/2006/picture">
+            <wp:extent cx="5120640" cy="3413760"/>
+            <wp:docPr id="11" name="Picture 11"/>
+            <wp:cNvGraphicFramePr>
+              <a:graphicFrameLocks noChangeAspect="1"/>
+            </wp:cNvGraphicFramePr>
+            <a:graphic>
+              <a:graphicData uri="http://schemas.openxmlformats.org/drawingml/2006/picture">
+                <pic:pic>
+                  <pic:nvPicPr>
+                    <pic:cNvPr id="0" name="21-admin-Phnnh.png"/>
+                    <pic:cNvPicPr/>
+                  </pic:nvPicPr>
+                  <pic:blipFill>
+                    <a:blip r:embed="rId19"/>
+                    <a:stretch>
+                      <a:fillRect/>
+                    </a:stretch>
+                  </pic:blipFill>
+                  <pic:spPr>
+                    <a:xfrm>
+                      <a:off x="0" y="0"/>
+                      <a:ext cx="5120640" cy="3413760"/>
+                    </a:xfrm>
+                    <a:prstGeom prst="rect"/>
+                  </pic:spPr>
+                </pic:pic>
+              </a:graphicData>
+            </a:graphic>
+          </wp:inline>
+        </w:drawing>
+      </w:r>
+    </w:p>
+    <w:p>
+      <w:pPr>
+        <w:jc w:val="center"/>
+      </w:pPr>
+      <w:r>
+        <w:rPr>
+          <w:i/>
+          <w:color w:val="5A6960"/>
+          <w:sz w:val="17"/>
+        </w:rPr>
+        <w:t>Hình 3.9 — Tiếp nhận &amp; xử lý Phản ánh</w:t>
+      </w:r>
+    </w:p>
+    <w:p>
+      <w:pPr>
+        <w:jc w:val="center"/>
+      </w:pPr>
+      <w:r>
+        <w:drawing>
+          <wp:inline xmlns:a="http://schemas.openxmlformats.org/drawingml/2006/main" xmlns:pic="http://schemas.openxmlformats.org/drawingml/2006/picture">
+            <wp:extent cx="5120640" cy="3413760"/>
+            <wp:docPr id="12" name="Picture 12"/>
+            <wp:cNvGraphicFramePr>
+              <a:graphicFrameLocks noChangeAspect="1"/>
+            </wp:cNvGraphicFramePr>
+            <a:graphic>
+              <a:graphicData uri="http://schemas.openxmlformats.org/drawingml/2006/picture">
+                <pic:pic>
+                  <pic:nvPicPr>
+                    <pic:cNvPr id="0" name="21-admin-Tinch.png"/>
+                    <pic:cNvPicPr/>
+                  </pic:nvPicPr>
+                  <pic:blipFill>
+                    <a:blip r:embed="rId20"/>
+                    <a:stretch>
+                      <a:fillRect/>
+                    </a:stretch>
+                  </pic:blipFill>
+                  <pic:spPr>
+                    <a:xfrm>
+                      <a:off x="0" y="0"/>
+                      <a:ext cx="5120640" cy="3413760"/>
+                    </a:xfrm>
+                    <a:prstGeom prst="rect"/>
+                  </pic:spPr>
+                </pic:pic>
+              </a:graphicData>
+            </a:graphic>
+          </wp:inline>
+        </w:drawing>
+      </w:r>
+    </w:p>
+    <w:p>
+      <w:pPr>
+        <w:jc w:val="center"/>
+      </w:pPr>
+      <w:r>
+        <w:rPr>
+          <w:i/>
+          <w:color w:val="5A6960"/>
+          <w:sz w:val="17"/>
+        </w:rPr>
+        <w:t>Hình 3.10 — Quản lý Tiện ích &amp; đặt chỗ</w:t>
+      </w:r>
+    </w:p>
+    <w:p>
+      <w:pPr>
+        <w:jc w:val="center"/>
+      </w:pPr>
+      <w:r>
+        <w:drawing>
+          <wp:inline xmlns:a="http://schemas.openxmlformats.org/drawingml/2006/main" xmlns:pic="http://schemas.openxmlformats.org/drawingml/2006/picture">
+            <wp:extent cx="5120640" cy="3413760"/>
+            <wp:docPr id="13" name="Picture 13"/>
+            <wp:cNvGraphicFramePr>
+              <a:graphicFrameLocks noChangeAspect="1"/>
+            </wp:cNvGraphicFramePr>
+            <a:graphic>
+              <a:graphicData uri="http://schemas.openxmlformats.org/drawingml/2006/picture">
+                <pic:pic>
+                  <pic:nvPicPr>
+                    <pic:cNvPr id="0" name="21-admin-BoHnhSauBnGiao.png"/>
+                    <pic:cNvPicPr/>
+                  </pic:nvPicPr>
+                  <pic:blipFill>
+                    <a:blip r:embed="rId21"/>
+                    <a:stretch>
+                      <a:fillRect/>
+                    </a:stretch>
+                  </pic:blipFill>
+                  <pic:spPr>
+                    <a:xfrm>
+                      <a:off x="0" y="0"/>
+                      <a:ext cx="5120640" cy="3413760"/>
+                    </a:xfrm>
+                    <a:prstGeom prst="rect"/>
+                  </pic:spPr>
+                </pic:pic>
+              </a:graphicData>
+            </a:graphic>
+          </wp:inline>
+        </w:drawing>
+      </w:r>
+    </w:p>
+    <w:p>
+      <w:pPr>
+        <w:jc w:val="center"/>
+      </w:pPr>
+      <w:r>
+        <w:rPr>
+          <w:i/>
+          <w:color w:val="5A6960"/>
+          <w:sz w:val="17"/>
+        </w:rPr>
+        <w:t>Hình 3.11 — Bảo hành sau bàn giao</w:t>
+      </w:r>
+    </w:p>
+    <w:p>
+      <w:pPr>
+        <w:jc w:val="center"/>
+      </w:pPr>
+      <w:r>
+        <w:drawing>
+          <wp:inline xmlns:a="http://schemas.openxmlformats.org/drawingml/2006/main" xmlns:pic="http://schemas.openxmlformats.org/drawingml/2006/picture">
+            <wp:extent cx="5120640" cy="3413760"/>
+            <wp:docPr id="14" name="Picture 14"/>
+            <wp:cNvGraphicFramePr>
+              <a:graphicFrameLocks noChangeAspect="1"/>
+            </wp:cNvGraphicFramePr>
+            <a:graphic>
+              <a:graphicData uri="http://schemas.openxmlformats.org/drawingml/2006/picture">
+                <pic:pic>
+                  <pic:nvPicPr>
+                    <pic:cNvPr id="0" name="21-admin-QunLinNc.png"/>
+                    <pic:cNvPicPr/>
+                  </pic:nvPicPr>
+                  <pic:blipFill>
+                    <a:blip r:embed="rId22"/>
+                    <a:stretch>
+                      <a:fillRect/>
+                    </a:stretch>
+                  </pic:blipFill>
+                  <pic:spPr>
+                    <a:xfrm>
+                      <a:off x="0" y="0"/>
+                      <a:ext cx="5120640" cy="3413760"/>
+                    </a:xfrm>
+                    <a:prstGeom prst="rect"/>
+                  </pic:spPr>
+                </pic:pic>
+              </a:graphicData>
+            </a:graphic>
+          </wp:inline>
+        </w:drawing>
+      </w:r>
+    </w:p>
+    <w:p>
+      <w:pPr>
+        <w:jc w:val="center"/>
+      </w:pPr>
+      <w:r>
+        <w:rPr>
+          <w:i/>
+          <w:color w:val="5A6960"/>
+          <w:sz w:val="17"/>
+        </w:rPr>
+        <w:t>Hình 3.12 — Quản lý Điện nước (ghi chỉ số)</w:t>
+      </w:r>
+    </w:p>
+    <w:p>
+      <w:pPr>
+        <w:jc w:val="center"/>
+      </w:pPr>
+      <w:r>
+        <w:drawing>
+          <wp:inline xmlns:a="http://schemas.openxmlformats.org/drawingml/2006/main" xmlns:pic="http://schemas.openxmlformats.org/drawingml/2006/picture">
+            <wp:extent cx="5486400" cy="3657600"/>
+            <wp:docPr id="15" name="Picture 15"/>
+            <wp:cNvGraphicFramePr>
+              <a:graphicFrameLocks noChangeAspect="1"/>
+            </wp:cNvGraphicFramePr>
+            <a:graphic>
+              <a:graphicData uri="http://schemas.openxmlformats.org/drawingml/2006/picture">
+                <pic:pic>
+                  <pic:nvPicPr>
+                    <pic:cNvPr id="0" name="21-admin-HanTngHp.png"/>
+                    <pic:cNvPicPr/>
+                  </pic:nvPicPr>
+                  <pic:blipFill>
+                    <a:blip r:embed="rId23"/>
+                    <a:stretch>
+                      <a:fillRect/>
+                    </a:stretch>
+                  </pic:blipFill>
+                  <pic:spPr>
+                    <a:xfrm>
+                      <a:off x="0" y="0"/>
+                      <a:ext cx="5486400" cy="3657600"/>
+                    </a:xfrm>
+                    <a:prstGeom prst="rect"/>
+                  </pic:spPr>
+                </pic:pic>
+              </a:graphicData>
+            </a:graphic>
+          </wp:inline>
+        </w:drawing>
+      </w:r>
+    </w:p>
+    <w:p>
+      <w:pPr>
+        <w:jc w:val="center"/>
+      </w:pPr>
+      <w:r>
+        <w:rPr>
+          <w:i/>
+          <w:color w:val="5A6960"/>
+          <w:sz w:val="17"/>
+        </w:rPr>
+        <w:t>Hình 3.13 — Hóa đơn tổng hợp (quản lý thu, QR, xuất Excel)</w:t>
       </w:r>
     </w:p>
     <w:p>
@@ -2263,7 +2731,7 @@
         <w:drawing>
           <wp:inline xmlns:a="http://schemas.openxmlformats.org/drawingml/2006/main" xmlns:pic="http://schemas.openxmlformats.org/drawingml/2006/picture">
             <wp:extent cx="4754880" cy="3169920"/>
-            <wp:docPr id="7" name="Picture 7"/>
+            <wp:docPr id="16" name="Picture 16"/>
             <wp:cNvGraphicFramePr>
               <a:graphicFrameLocks noChangeAspect="1"/>
             </wp:cNvGraphicFramePr>
@@ -2275,7 +2743,7 @@
                     <pic:cNvPicPr/>
                   </pic:nvPicPr>
                   <pic:blipFill>
-                    <a:blip r:embed="rId15"/>
+                    <a:blip r:embed="rId24"/>
                     <a:stretch>
                       <a:fillRect/>
                     </a:stretch>
@@ -2315,7 +2783,7 @@
         <w:drawing>
           <wp:inline xmlns:a="http://schemas.openxmlformats.org/drawingml/2006/main" xmlns:pic="http://schemas.openxmlformats.org/drawingml/2006/picture">
             <wp:extent cx="5486400" cy="3657600"/>
-            <wp:docPr id="8" name="Picture 8"/>
+            <wp:docPr id="17" name="Picture 17"/>
             <wp:cNvGraphicFramePr>
               <a:graphicFrameLocks noChangeAspect="1"/>
             </wp:cNvGraphicFramePr>
@@ -2327,7 +2795,7 @@
                     <pic:cNvPicPr/>
                   </pic:nvPicPr>
                   <pic:blipFill>
-                    <a:blip r:embed="rId16"/>
+                    <a:blip r:embed="rId25"/>
                     <a:stretch>
                       <a:fillRect/>
                     </a:stretch>
@@ -2934,7 +3402,7 @@
         <w:drawing>
           <wp:inline xmlns:a="http://schemas.openxmlformats.org/drawingml/2006/main" xmlns:pic="http://schemas.openxmlformats.org/drawingml/2006/picture">
             <wp:extent cx="5486400" cy="3657600"/>
-            <wp:docPr id="9" name="Picture 9"/>
+            <wp:docPr id="18" name="Picture 18"/>
             <wp:cNvGraphicFramePr>
               <a:graphicFrameLocks noChangeAspect="1"/>
             </wp:cNvGraphicFramePr>
@@ -2946,7 +3414,7 @@
                     <pic:cNvPicPr/>
                   </pic:nvPicPr>
                   <pic:blipFill>
-                    <a:blip r:embed="rId17"/>
+                    <a:blip r:embed="rId26"/>
                     <a:stretch>
                       <a:fillRect/>
                     </a:stretch>
@@ -2986,7 +3454,7 @@
         <w:drawing>
           <wp:inline xmlns:a="http://schemas.openxmlformats.org/drawingml/2006/main" xmlns:pic="http://schemas.openxmlformats.org/drawingml/2006/picture">
             <wp:extent cx="5120640" cy="3413760"/>
-            <wp:docPr id="10" name="Picture 10"/>
+            <wp:docPr id="19" name="Picture 19"/>
             <wp:cNvGraphicFramePr>
               <a:graphicFrameLocks noChangeAspect="1"/>
             </wp:cNvGraphicFramePr>
@@ -2998,7 +3466,7 @@
                     <pic:cNvPicPr/>
                   </pic:nvPicPr>
                   <pic:blipFill>
-                    <a:blip r:embed="rId18"/>
+                    <a:blip r:embed="rId27"/>
                     <a:stretch>
                       <a:fillRect/>
                     </a:stretch>
@@ -3038,7 +3506,7 @@
         <w:drawing>
           <wp:inline xmlns:a="http://schemas.openxmlformats.org/drawingml/2006/main" xmlns:pic="http://schemas.openxmlformats.org/drawingml/2006/picture">
             <wp:extent cx="5120640" cy="3413760"/>
-            <wp:docPr id="11" name="Picture 11"/>
+            <wp:docPr id="20" name="Picture 20"/>
             <wp:cNvGraphicFramePr>
               <a:graphicFrameLocks noChangeAspect="1"/>
             </wp:cNvGraphicFramePr>
@@ -3050,7 +3518,7 @@
                     <pic:cNvPicPr/>
                   </pic:nvPicPr>
                   <pic:blipFill>
-                    <a:blip r:embed="rId19"/>
+                    <a:blip r:embed="rId28"/>
                     <a:stretch>
                       <a:fillRect/>
                     </a:stretch>
@@ -3090,7 +3558,7 @@
         <w:drawing>
           <wp:inline xmlns:a="http://schemas.openxmlformats.org/drawingml/2006/main" xmlns:pic="http://schemas.openxmlformats.org/drawingml/2006/picture">
             <wp:extent cx="5120640" cy="3413760"/>
-            <wp:docPr id="12" name="Picture 12"/>
+            <wp:docPr id="21" name="Picture 21"/>
             <wp:cNvGraphicFramePr>
               <a:graphicFrameLocks noChangeAspect="1"/>
             </wp:cNvGraphicFramePr>
@@ -3102,7 +3570,7 @@
                     <pic:cNvPicPr/>
                   </pic:nvPicPr>
                   <pic:blipFill>
-                    <a:blip r:embed="rId20"/>
+                    <a:blip r:embed="rId29"/>
                     <a:stretch>
                       <a:fillRect/>
                     </a:stretch>
@@ -3142,7 +3610,7 @@
         <w:drawing>
           <wp:inline xmlns:a="http://schemas.openxmlformats.org/drawingml/2006/main" xmlns:pic="http://schemas.openxmlformats.org/drawingml/2006/picture">
             <wp:extent cx="5120640" cy="3413760"/>
-            <wp:docPr id="13" name="Picture 13"/>
+            <wp:docPr id="22" name="Picture 22"/>
             <wp:cNvGraphicFramePr>
               <a:graphicFrameLocks noChangeAspect="1"/>
             </wp:cNvGraphicFramePr>
@@ -3154,7 +3622,7 @@
                     <pic:cNvPicPr/>
                   </pic:nvPicPr>
                   <pic:blipFill>
-                    <a:blip r:embed="rId21"/>
+                    <a:blip r:embed="rId30"/>
                     <a:stretch>
                       <a:fillRect/>
                     </a:stretch>
@@ -3194,7 +3662,7 @@
         <w:drawing>
           <wp:inline xmlns:a="http://schemas.openxmlformats.org/drawingml/2006/main" xmlns:pic="http://schemas.openxmlformats.org/drawingml/2006/picture">
             <wp:extent cx="5120640" cy="3413760"/>
-            <wp:docPr id="14" name="Picture 14"/>
+            <wp:docPr id="23" name="Picture 23"/>
             <wp:cNvGraphicFramePr>
               <a:graphicFrameLocks noChangeAspect="1"/>
             </wp:cNvGraphicFramePr>
@@ -3206,7 +3674,7 @@
                     <pic:cNvPicPr/>
                   </pic:nvPicPr>
                   <pic:blipFill>
-                    <a:blip r:embed="rId22"/>
+                    <a:blip r:embed="rId31"/>
                     <a:stretch>
                       <a:fillRect/>
                     </a:stretch>

</xml_diff>

<commit_message>
docs(user-guide): chèn 4 ảnh quản trị chi tiết (ghi chỉ số AI, thi công/ký quỹ, Báo cáo KPI, form cư dân)
- USER_GUIDE_v1.6.docx: 27 ảnh (4.48 MB)
- Thêm: Ghi chỉ số di động (AI), Thi công & Ký quỹ (TC-TPCP-2026-0002, 100Tr),
  Báo cáo & KPI điều hành, Form Thêm cư dân mới (HĐĐT)
</commit_message>
<xml_diff>
--- a/USER_GUIDE_v1.6.docx
+++ b/USER_GUIDE_v1.6.docx
@@ -2637,6 +2637,214 @@
     </w:p>
     <w:p>
       <w:pPr>
+        <w:jc w:val="center"/>
+      </w:pPr>
+      <w:r>
+        <w:drawing>
+          <wp:inline xmlns:a="http://schemas.openxmlformats.org/drawingml/2006/main" xmlns:pic="http://schemas.openxmlformats.org/drawingml/2006/picture">
+            <wp:extent cx="5486400" cy="3657600"/>
+            <wp:docPr id="16" name="Picture 16"/>
+            <wp:cNvGraphicFramePr>
+              <a:graphicFrameLocks noChangeAspect="1"/>
+            </wp:cNvGraphicFramePr>
+            <a:graphic>
+              <a:graphicData uri="http://schemas.openxmlformats.org/drawingml/2006/picture">
+                <pic:pic>
+                  <pic:nvPicPr>
+                    <pic:cNvPr id="0" name="22-admin-GhiChSMobile.png"/>
+                    <pic:cNvPicPr/>
+                  </pic:nvPicPr>
+                  <pic:blipFill>
+                    <a:blip r:embed="rId24"/>
+                    <a:stretch>
+                      <a:fillRect/>
+                    </a:stretch>
+                  </pic:blipFill>
+                  <pic:spPr>
+                    <a:xfrm>
+                      <a:off x="0" y="0"/>
+                      <a:ext cx="5486400" cy="3657600"/>
+                    </a:xfrm>
+                    <a:prstGeom prst="rect"/>
+                  </pic:spPr>
+                </pic:pic>
+              </a:graphicData>
+            </a:graphic>
+          </wp:inline>
+        </w:drawing>
+      </w:r>
+    </w:p>
+    <w:p>
+      <w:pPr>
+        <w:jc w:val="center"/>
+      </w:pPr>
+      <w:r>
+        <w:rPr>
+          <w:i/>
+          <w:color w:val="5A6960"/>
+          <w:sz w:val="17"/>
+        </w:rPr>
+        <w:t>Hình 3.14 — Ghi chỉ số di động (AI quét công tơ điện/nước)</w:t>
+      </w:r>
+    </w:p>
+    <w:p>
+      <w:pPr>
+        <w:jc w:val="center"/>
+      </w:pPr>
+      <w:r>
+        <w:drawing>
+          <wp:inline xmlns:a="http://schemas.openxmlformats.org/drawingml/2006/main" xmlns:pic="http://schemas.openxmlformats.org/drawingml/2006/picture">
+            <wp:extent cx="5486400" cy="3657600"/>
+            <wp:docPr id="17" name="Picture 17"/>
+            <wp:cNvGraphicFramePr>
+              <a:graphicFrameLocks noChangeAspect="1"/>
+            </wp:cNvGraphicFramePr>
+            <a:graphic>
+              <a:graphicData uri="http://schemas.openxmlformats.org/drawingml/2006/picture">
+                <pic:pic>
+                  <pic:nvPicPr>
+                    <pic:cNvPr id="0" name="22-admin-ThiCong.png"/>
+                    <pic:cNvPicPr/>
+                  </pic:nvPicPr>
+                  <pic:blipFill>
+                    <a:blip r:embed="rId25"/>
+                    <a:stretch>
+                      <a:fillRect/>
+                    </a:stretch>
+                  </pic:blipFill>
+                  <pic:spPr>
+                    <a:xfrm>
+                      <a:off x="0" y="0"/>
+                      <a:ext cx="5486400" cy="3657600"/>
+                    </a:xfrm>
+                    <a:prstGeom prst="rect"/>
+                  </pic:spPr>
+                </pic:pic>
+              </a:graphicData>
+            </a:graphic>
+          </wp:inline>
+        </w:drawing>
+      </w:r>
+    </w:p>
+    <w:p>
+      <w:pPr>
+        <w:jc w:val="center"/>
+      </w:pPr>
+      <w:r>
+        <w:rPr>
+          <w:i/>
+          <w:color w:val="5A6960"/>
+          <w:sz w:val="17"/>
+        </w:rPr>
+        <w:t>Hình 3.15 — Đăng ký thi công &amp; ký quỹ (hồ sơ, 100Tr, thẻ công nhân)</w:t>
+      </w:r>
+    </w:p>
+    <w:p>
+      <w:pPr>
+        <w:jc w:val="center"/>
+      </w:pPr>
+      <w:r>
+        <w:drawing>
+          <wp:inline xmlns:a="http://schemas.openxmlformats.org/drawingml/2006/main" xmlns:pic="http://schemas.openxmlformats.org/drawingml/2006/picture">
+            <wp:extent cx="5486400" cy="3657600"/>
+            <wp:docPr id="18" name="Picture 18"/>
+            <wp:cNvGraphicFramePr>
+              <a:graphicFrameLocks noChangeAspect="1"/>
+            </wp:cNvGraphicFramePr>
+            <a:graphic>
+              <a:graphicData uri="http://schemas.openxmlformats.org/drawingml/2006/picture">
+                <pic:pic>
+                  <pic:nvPicPr>
+                    <pic:cNvPr id="0" name="22-admin-BoCoKPIiuHnh.png"/>
+                    <pic:cNvPicPr/>
+                  </pic:nvPicPr>
+                  <pic:blipFill>
+                    <a:blip r:embed="rId26"/>
+                    <a:stretch>
+                      <a:fillRect/>
+                    </a:stretch>
+                  </pic:blipFill>
+                  <pic:spPr>
+                    <a:xfrm>
+                      <a:off x="0" y="0"/>
+                      <a:ext cx="5486400" cy="3657600"/>
+                    </a:xfrm>
+                    <a:prstGeom prst="rect"/>
+                  </pic:spPr>
+                </pic:pic>
+              </a:graphicData>
+            </a:graphic>
+          </wp:inline>
+        </w:drawing>
+      </w:r>
+    </w:p>
+    <w:p>
+      <w:pPr>
+        <w:jc w:val="center"/>
+      </w:pPr>
+      <w:r>
+        <w:rPr>
+          <w:i/>
+          <w:color w:val="5A6960"/>
+          <w:sz w:val="17"/>
+        </w:rPr>
+        <w:t>Hình 3.16 — Báo cáo &amp; KPI điều hành (4 trụ cột)</w:t>
+      </w:r>
+    </w:p>
+    <w:p>
+      <w:pPr>
+        <w:jc w:val="center"/>
+      </w:pPr>
+      <w:r>
+        <w:drawing>
+          <wp:inline xmlns:a="http://schemas.openxmlformats.org/drawingml/2006/main" xmlns:pic="http://schemas.openxmlformats.org/drawingml/2006/picture">
+            <wp:extent cx="5120640" cy="3413760"/>
+            <wp:docPr id="19" name="Picture 19"/>
+            <wp:cNvGraphicFramePr>
+              <a:graphicFrameLocks noChangeAspect="1"/>
+            </wp:cNvGraphicFramePr>
+            <a:graphic>
+              <a:graphicData uri="http://schemas.openxmlformats.org/drawingml/2006/picture">
+                <pic:pic>
+                  <pic:nvPicPr>
+                    <pic:cNvPr id="0" name="23-admin-CuDan-form.png"/>
+                    <pic:cNvPicPr/>
+                  </pic:nvPicPr>
+                  <pic:blipFill>
+                    <a:blip r:embed="rId27"/>
+                    <a:stretch>
+                      <a:fillRect/>
+                    </a:stretch>
+                  </pic:blipFill>
+                  <pic:spPr>
+                    <a:xfrm>
+                      <a:off x="0" y="0"/>
+                      <a:ext cx="5120640" cy="3413760"/>
+                    </a:xfrm>
+                    <a:prstGeom prst="rect"/>
+                  </pic:spPr>
+                </pic:pic>
+              </a:graphicData>
+            </a:graphic>
+          </wp:inline>
+        </w:drawing>
+      </w:r>
+    </w:p>
+    <w:p>
+      <w:pPr>
+        <w:jc w:val="center"/>
+      </w:pPr>
+      <w:r>
+        <w:rPr>
+          <w:i/>
+          <w:color w:val="5A6960"/>
+          <w:sz w:val="17"/>
+        </w:rPr>
+        <w:t>Hình 3.17 — Form Thêm cư dân mới (thông tin &amp; HĐĐT)</w:t>
+      </w:r>
+    </w:p>
+    <w:p>
+      <w:pPr>
         <w:pStyle w:val="Heading2"/>
       </w:pPr>
       <w:r>
@@ -2731,7 +2939,7 @@
         <w:drawing>
           <wp:inline xmlns:a="http://schemas.openxmlformats.org/drawingml/2006/main" xmlns:pic="http://schemas.openxmlformats.org/drawingml/2006/picture">
             <wp:extent cx="4754880" cy="3169920"/>
-            <wp:docPr id="16" name="Picture 16"/>
+            <wp:docPr id="20" name="Picture 20"/>
             <wp:cNvGraphicFramePr>
               <a:graphicFrameLocks noChangeAspect="1"/>
             </wp:cNvGraphicFramePr>
@@ -2743,7 +2951,7 @@
                     <pic:cNvPicPr/>
                   </pic:nvPicPr>
                   <pic:blipFill>
-                    <a:blip r:embed="rId24"/>
+                    <a:blip r:embed="rId28"/>
                     <a:stretch>
                       <a:fillRect/>
                     </a:stretch>
@@ -2783,7 +2991,7 @@
         <w:drawing>
           <wp:inline xmlns:a="http://schemas.openxmlformats.org/drawingml/2006/main" xmlns:pic="http://schemas.openxmlformats.org/drawingml/2006/picture">
             <wp:extent cx="5486400" cy="3657600"/>
-            <wp:docPr id="17" name="Picture 17"/>
+            <wp:docPr id="21" name="Picture 21"/>
             <wp:cNvGraphicFramePr>
               <a:graphicFrameLocks noChangeAspect="1"/>
             </wp:cNvGraphicFramePr>
@@ -2795,7 +3003,7 @@
                     <pic:cNvPicPr/>
                   </pic:nvPicPr>
                   <pic:blipFill>
-                    <a:blip r:embed="rId25"/>
+                    <a:blip r:embed="rId29"/>
                     <a:stretch>
                       <a:fillRect/>
                     </a:stretch>
@@ -3402,7 +3610,7 @@
         <w:drawing>
           <wp:inline xmlns:a="http://schemas.openxmlformats.org/drawingml/2006/main" xmlns:pic="http://schemas.openxmlformats.org/drawingml/2006/picture">
             <wp:extent cx="5486400" cy="3657600"/>
-            <wp:docPr id="18" name="Picture 18"/>
+            <wp:docPr id="22" name="Picture 22"/>
             <wp:cNvGraphicFramePr>
               <a:graphicFrameLocks noChangeAspect="1"/>
             </wp:cNvGraphicFramePr>
@@ -3414,7 +3622,7 @@
                     <pic:cNvPicPr/>
                   </pic:nvPicPr>
                   <pic:blipFill>
-                    <a:blip r:embed="rId26"/>
+                    <a:blip r:embed="rId30"/>
                     <a:stretch>
                       <a:fillRect/>
                     </a:stretch>
@@ -3454,7 +3662,7 @@
         <w:drawing>
           <wp:inline xmlns:a="http://schemas.openxmlformats.org/drawingml/2006/main" xmlns:pic="http://schemas.openxmlformats.org/drawingml/2006/picture">
             <wp:extent cx="5120640" cy="3413760"/>
-            <wp:docPr id="19" name="Picture 19"/>
+            <wp:docPr id="23" name="Picture 23"/>
             <wp:cNvGraphicFramePr>
               <a:graphicFrameLocks noChangeAspect="1"/>
             </wp:cNvGraphicFramePr>
@@ -3466,7 +3674,7 @@
                     <pic:cNvPicPr/>
                   </pic:nvPicPr>
                   <pic:blipFill>
-                    <a:blip r:embed="rId27"/>
+                    <a:blip r:embed="rId31"/>
                     <a:stretch>
                       <a:fillRect/>
                     </a:stretch>
@@ -3506,7 +3714,7 @@
         <w:drawing>
           <wp:inline xmlns:a="http://schemas.openxmlformats.org/drawingml/2006/main" xmlns:pic="http://schemas.openxmlformats.org/drawingml/2006/picture">
             <wp:extent cx="5120640" cy="3413760"/>
-            <wp:docPr id="20" name="Picture 20"/>
+            <wp:docPr id="24" name="Picture 24"/>
             <wp:cNvGraphicFramePr>
               <a:graphicFrameLocks noChangeAspect="1"/>
             </wp:cNvGraphicFramePr>
@@ -3518,7 +3726,7 @@
                     <pic:cNvPicPr/>
                   </pic:nvPicPr>
                   <pic:blipFill>
-                    <a:blip r:embed="rId28"/>
+                    <a:blip r:embed="rId32"/>
                     <a:stretch>
                       <a:fillRect/>
                     </a:stretch>
@@ -3558,7 +3766,7 @@
         <w:drawing>
           <wp:inline xmlns:a="http://schemas.openxmlformats.org/drawingml/2006/main" xmlns:pic="http://schemas.openxmlformats.org/drawingml/2006/picture">
             <wp:extent cx="5120640" cy="3413760"/>
-            <wp:docPr id="21" name="Picture 21"/>
+            <wp:docPr id="25" name="Picture 25"/>
             <wp:cNvGraphicFramePr>
               <a:graphicFrameLocks noChangeAspect="1"/>
             </wp:cNvGraphicFramePr>
@@ -3570,7 +3778,7 @@
                     <pic:cNvPicPr/>
                   </pic:nvPicPr>
                   <pic:blipFill>
-                    <a:blip r:embed="rId29"/>
+                    <a:blip r:embed="rId33"/>
                     <a:stretch>
                       <a:fillRect/>
                     </a:stretch>
@@ -3610,7 +3818,7 @@
         <w:drawing>
           <wp:inline xmlns:a="http://schemas.openxmlformats.org/drawingml/2006/main" xmlns:pic="http://schemas.openxmlformats.org/drawingml/2006/picture">
             <wp:extent cx="5120640" cy="3413760"/>
-            <wp:docPr id="22" name="Picture 22"/>
+            <wp:docPr id="26" name="Picture 26"/>
             <wp:cNvGraphicFramePr>
               <a:graphicFrameLocks noChangeAspect="1"/>
             </wp:cNvGraphicFramePr>
@@ -3622,7 +3830,7 @@
                     <pic:cNvPicPr/>
                   </pic:nvPicPr>
                   <pic:blipFill>
-                    <a:blip r:embed="rId30"/>
+                    <a:blip r:embed="rId34"/>
                     <a:stretch>
                       <a:fillRect/>
                     </a:stretch>
@@ -3662,7 +3870,7 @@
         <w:drawing>
           <wp:inline xmlns:a="http://schemas.openxmlformats.org/drawingml/2006/main" xmlns:pic="http://schemas.openxmlformats.org/drawingml/2006/picture">
             <wp:extent cx="5120640" cy="3413760"/>
-            <wp:docPr id="23" name="Picture 23"/>
+            <wp:docPr id="27" name="Picture 27"/>
             <wp:cNvGraphicFramePr>
               <a:graphicFrameLocks noChangeAspect="1"/>
             </wp:cNvGraphicFramePr>
@@ -3674,7 +3882,7 @@
                     <pic:cNvPicPr/>
                   </pic:nvPicPr>
                   <pic:blipFill>
-                    <a:blip r:embed="rId31"/>
+                    <a:blip r:embed="rId35"/>
                     <a:stretch>
                       <a:fillRect/>
                     </a:stretch>

</xml_diff>

<commit_message>
docs(user-guide): chèn 4 ảnh MONOLITH (KPI dashboard, card inventory, empty states) chương 3
</commit_message>
<xml_diff>
--- a/USER_GUIDE_v1.6.docx
+++ b/USER_GUIDE_v1.6.docx
@@ -2114,6 +2114,58 @@
     </w:p>
     <w:p>
       <w:pPr>
+        <w:jc w:val="center"/>
+      </w:pPr>
+      <w:r>
+        <w:drawing>
+          <wp:inline xmlns:a="http://schemas.openxmlformats.org/drawingml/2006/main" xmlns:pic="http://schemas.openxmlformats.org/drawingml/2006/picture">
+            <wp:extent cx="5486400" cy="3810000"/>
+            <wp:docPr id="8" name="Picture 8"/>
+            <wp:cNvGraphicFramePr>
+              <a:graphicFrameLocks noChangeAspect="1"/>
+            </wp:cNvGraphicFramePr>
+            <a:graphic>
+              <a:graphicData uri="http://schemas.openxmlformats.org/drawingml/2006/picture">
+                <pic:pic>
+                  <pic:nvPicPr>
+                    <pic:cNvPr id="0" name="30-dashboard-kpi.png"/>
+                    <pic:cNvPicPr/>
+                  </pic:nvPicPr>
+                  <pic:blipFill>
+                    <a:blip r:embed="rId16"/>
+                    <a:stretch>
+                      <a:fillRect/>
+                    </a:stretch>
+                  </pic:blipFill>
+                  <pic:spPr>
+                    <a:xfrm>
+                      <a:off x="0" y="0"/>
+                      <a:ext cx="5486400" cy="3810000"/>
+                    </a:xfrm>
+                    <a:prstGeom prst="rect"/>
+                  </pic:spPr>
+                </pic:pic>
+              </a:graphicData>
+            </a:graphic>
+          </wp:inline>
+        </w:drawing>
+      </w:r>
+    </w:p>
+    <w:p>
+      <w:pPr>
+        <w:jc w:val="center"/>
+      </w:pPr>
+      <w:r>
+        <w:rPr>
+          <w:i/>
+          <w:color w:val="5A6960"/>
+          <w:sz w:val="17"/>
+        </w:rPr>
+        <w:t>Hình 3.5b — Báo cáo KPI Tổng quan (chuẩn MONOLITH): 4 thẻ chỉ số có accent riêng, thẻ Tỷ lệ lấp đầy nổi bật</w:t>
+      </w:r>
+    </w:p>
+    <w:p>
+      <w:pPr>
         <w:pStyle w:val="ListBullet"/>
       </w:pPr>
       <w:r>
@@ -2168,7 +2220,7 @@
         <w:drawing>
           <wp:inline xmlns:a="http://schemas.openxmlformats.org/drawingml/2006/main" xmlns:pic="http://schemas.openxmlformats.org/drawingml/2006/picture">
             <wp:extent cx="5486400" cy="3657600"/>
-            <wp:docPr id="8" name="Picture 8"/>
+            <wp:docPr id="9" name="Picture 9"/>
             <wp:cNvGraphicFramePr>
               <a:graphicFrameLocks noChangeAspect="1"/>
             </wp:cNvGraphicFramePr>
@@ -2180,7 +2232,7 @@
                     <pic:cNvPicPr/>
                   </pic:nvPicPr>
                   <pic:blipFill>
-                    <a:blip r:embed="rId16"/>
+                    <a:blip r:embed="rId17"/>
                     <a:stretch>
                       <a:fillRect/>
                     </a:stretch>
@@ -2279,7 +2331,7 @@
         <w:drawing>
           <wp:inline xmlns:a="http://schemas.openxmlformats.org/drawingml/2006/main" xmlns:pic="http://schemas.openxmlformats.org/drawingml/2006/picture">
             <wp:extent cx="5486400" cy="3657600"/>
-            <wp:docPr id="9" name="Picture 9"/>
+            <wp:docPr id="10" name="Picture 10"/>
             <wp:cNvGraphicFramePr>
               <a:graphicFrameLocks noChangeAspect="1"/>
             </wp:cNvGraphicFramePr>
@@ -2291,7 +2343,7 @@
                     <pic:cNvPicPr/>
                   </pic:nvPicPr>
                   <pic:blipFill>
-                    <a:blip r:embed="rId17"/>
+                    <a:blip r:embed="rId18"/>
                     <a:stretch>
                       <a:fillRect/>
                     </a:stretch>
@@ -2330,8 +2382,60 @@
       <w:r>
         <w:drawing>
           <wp:inline xmlns:a="http://schemas.openxmlformats.org/drawingml/2006/main" xmlns:pic="http://schemas.openxmlformats.org/drawingml/2006/picture">
+            <wp:extent cx="5303520" cy="3683000"/>
+            <wp:docPr id="11" name="Picture 11"/>
+            <wp:cNvGraphicFramePr>
+              <a:graphicFrameLocks noChangeAspect="1"/>
+            </wp:cNvGraphicFramePr>
+            <a:graphic>
+              <a:graphicData uri="http://schemas.openxmlformats.org/drawingml/2006/picture">
+                <pic:pic>
+                  <pic:nvPicPr>
+                    <pic:cNvPr id="0" name="31-apartments-cards.png"/>
+                    <pic:cNvPicPr/>
+                  </pic:nvPicPr>
+                  <pic:blipFill>
+                    <a:blip r:embed="rId19"/>
+                    <a:stretch>
+                      <a:fillRect/>
+                    </a:stretch>
+                  </pic:blipFill>
+                  <pic:spPr>
+                    <a:xfrm>
+                      <a:off x="0" y="0"/>
+                      <a:ext cx="5303520" cy="3683000"/>
+                    </a:xfrm>
+                    <a:prstGeom prst="rect"/>
+                  </pic:spPr>
+                </pic:pic>
+              </a:graphicData>
+            </a:graphic>
+          </wp:inline>
+        </w:drawing>
+      </w:r>
+    </w:p>
+    <w:p>
+      <w:pPr>
+        <w:jc w:val="center"/>
+      </w:pPr>
+      <w:r>
+        <w:rPr>
+          <w:i/>
+          <w:color w:val="5A6960"/>
+          <w:sz w:val="17"/>
+        </w:rPr>
+        <w:t>Hình 3.7b — Chế độ xem thẻ căn hộ (Card Inventory, chuẩn MONOLITH Units): grid thẻ + badge trạng thái Đã/Chưa bàn giao</w:t>
+      </w:r>
+    </w:p>
+    <w:p>
+      <w:pPr>
+        <w:jc w:val="center"/>
+      </w:pPr>
+      <w:r>
+        <w:drawing>
+          <wp:inline xmlns:a="http://schemas.openxmlformats.org/drawingml/2006/main" xmlns:pic="http://schemas.openxmlformats.org/drawingml/2006/picture">
             <wp:extent cx="5486400" cy="3657600"/>
-            <wp:docPr id="10" name="Picture 10"/>
+            <wp:docPr id="12" name="Picture 12"/>
             <wp:cNvGraphicFramePr>
               <a:graphicFrameLocks noChangeAspect="1"/>
             </wp:cNvGraphicFramePr>
@@ -2343,7 +2447,7 @@
                     <pic:cNvPicPr/>
                   </pic:nvPicPr>
                   <pic:blipFill>
-                    <a:blip r:embed="rId18"/>
+                    <a:blip r:embed="rId20"/>
                     <a:stretch>
                       <a:fillRect/>
                     </a:stretch>
@@ -2383,7 +2487,7 @@
         <w:drawing>
           <wp:inline xmlns:a="http://schemas.openxmlformats.org/drawingml/2006/main" xmlns:pic="http://schemas.openxmlformats.org/drawingml/2006/picture">
             <wp:extent cx="5120640" cy="3413760"/>
-            <wp:docPr id="11" name="Picture 11"/>
+            <wp:docPr id="13" name="Picture 13"/>
             <wp:cNvGraphicFramePr>
               <a:graphicFrameLocks noChangeAspect="1"/>
             </wp:cNvGraphicFramePr>
@@ -2395,7 +2499,7 @@
                     <pic:cNvPicPr/>
                   </pic:nvPicPr>
                   <pic:blipFill>
-                    <a:blip r:embed="rId19"/>
+                    <a:blip r:embed="rId21"/>
                     <a:stretch>
                       <a:fillRect/>
                     </a:stretch>
@@ -2434,8 +2538,60 @@
       <w:r>
         <w:drawing>
           <wp:inline xmlns:a="http://schemas.openxmlformats.org/drawingml/2006/main" xmlns:pic="http://schemas.openxmlformats.org/drawingml/2006/picture">
+            <wp:extent cx="5120640" cy="3556000"/>
+            <wp:docPr id="14" name="Picture 14"/>
+            <wp:cNvGraphicFramePr>
+              <a:graphicFrameLocks noChangeAspect="1"/>
+            </wp:cNvGraphicFramePr>
+            <a:graphic>
+              <a:graphicData uri="http://schemas.openxmlformats.org/drawingml/2006/picture">
+                <pic:pic>
+                  <pic:nvPicPr>
+                    <pic:cNvPr id="0" name="32-feedback-empty.png"/>
+                    <pic:cNvPicPr/>
+                  </pic:nvPicPr>
+                  <pic:blipFill>
+                    <a:blip r:embed="rId22"/>
+                    <a:stretch>
+                      <a:fillRect/>
+                    </a:stretch>
+                  </pic:blipFill>
+                  <pic:spPr>
+                    <a:xfrm>
+                      <a:off x="0" y="0"/>
+                      <a:ext cx="5120640" cy="3556000"/>
+                    </a:xfrm>
+                    <a:prstGeom prst="rect"/>
+                  </pic:spPr>
+                </pic:pic>
+              </a:graphicData>
+            </a:graphic>
+          </wp:inline>
+        </w:drawing>
+      </w:r>
+    </w:p>
+    <w:p>
+      <w:pPr>
+        <w:jc w:val="center"/>
+      </w:pPr>
+      <w:r>
+        <w:rPr>
+          <w:i/>
+          <w:color w:val="5A6960"/>
+          <w:sz w:val="17"/>
+        </w:rPr>
+        <w:t>Hình 3.9b — Trạng thái rỗng (Empty State) khi không có phản ánh / không khớp bộ lọc</w:t>
+      </w:r>
+    </w:p>
+    <w:p>
+      <w:pPr>
+        <w:jc w:val="center"/>
+      </w:pPr>
+      <w:r>
+        <w:drawing>
+          <wp:inline xmlns:a="http://schemas.openxmlformats.org/drawingml/2006/main" xmlns:pic="http://schemas.openxmlformats.org/drawingml/2006/picture">
             <wp:extent cx="5120640" cy="3413760"/>
-            <wp:docPr id="12" name="Picture 12"/>
+            <wp:docPr id="15" name="Picture 15"/>
             <wp:cNvGraphicFramePr>
               <a:graphicFrameLocks noChangeAspect="1"/>
             </wp:cNvGraphicFramePr>
@@ -2447,7 +2603,7 @@
                     <pic:cNvPicPr/>
                   </pic:nvPicPr>
                   <pic:blipFill>
-                    <a:blip r:embed="rId20"/>
+                    <a:blip r:embed="rId23"/>
                     <a:stretch>
                       <a:fillRect/>
                     </a:stretch>
@@ -2486,8 +2642,60 @@
       <w:r>
         <w:drawing>
           <wp:inline xmlns:a="http://schemas.openxmlformats.org/drawingml/2006/main" xmlns:pic="http://schemas.openxmlformats.org/drawingml/2006/picture">
+            <wp:extent cx="5120640" cy="3556000"/>
+            <wp:docPr id="16" name="Picture 16"/>
+            <wp:cNvGraphicFramePr>
+              <a:graphicFrameLocks noChangeAspect="1"/>
+            </wp:cNvGraphicFramePr>
+            <a:graphic>
+              <a:graphicData uri="http://schemas.openxmlformats.org/drawingml/2006/picture">
+                <pic:pic>
+                  <pic:nvPicPr>
+                    <pic:cNvPr id="0" name="33-amenity-empty.png"/>
+                    <pic:cNvPicPr/>
+                  </pic:nvPicPr>
+                  <pic:blipFill>
+                    <a:blip r:embed="rId24"/>
+                    <a:stretch>
+                      <a:fillRect/>
+                    </a:stretch>
+                  </pic:blipFill>
+                  <pic:spPr>
+                    <a:xfrm>
+                      <a:off x="0" y="0"/>
+                      <a:ext cx="5120640" cy="3556000"/>
+                    </a:xfrm>
+                    <a:prstGeom prst="rect"/>
+                  </pic:spPr>
+                </pic:pic>
+              </a:graphicData>
+            </a:graphic>
+          </wp:inline>
+        </w:drawing>
+      </w:r>
+    </w:p>
+    <w:p>
+      <w:pPr>
+        <w:jc w:val="center"/>
+      </w:pPr>
+      <w:r>
+        <w:rPr>
+          <w:i/>
+          <w:color w:val="5A6960"/>
+          <w:sz w:val="17"/>
+        </w:rPr>
+        <w:t>Hình 3.10b — Trạng thái rỗng (Empty State) danh sách đặt chỗ / lịch sử tiện ích</w:t>
+      </w:r>
+    </w:p>
+    <w:p>
+      <w:pPr>
+        <w:jc w:val="center"/>
+      </w:pPr>
+      <w:r>
+        <w:drawing>
+          <wp:inline xmlns:a="http://schemas.openxmlformats.org/drawingml/2006/main" xmlns:pic="http://schemas.openxmlformats.org/drawingml/2006/picture">
             <wp:extent cx="5120640" cy="3413760"/>
-            <wp:docPr id="13" name="Picture 13"/>
+            <wp:docPr id="17" name="Picture 17"/>
             <wp:cNvGraphicFramePr>
               <a:graphicFrameLocks noChangeAspect="1"/>
             </wp:cNvGraphicFramePr>
@@ -2499,7 +2707,7 @@
                     <pic:cNvPicPr/>
                   </pic:nvPicPr>
                   <pic:blipFill>
-                    <a:blip r:embed="rId21"/>
+                    <a:blip r:embed="rId25"/>
                     <a:stretch>
                       <a:fillRect/>
                     </a:stretch>
@@ -2539,7 +2747,7 @@
         <w:drawing>
           <wp:inline xmlns:a="http://schemas.openxmlformats.org/drawingml/2006/main" xmlns:pic="http://schemas.openxmlformats.org/drawingml/2006/picture">
             <wp:extent cx="5120640" cy="3413760"/>
-            <wp:docPr id="14" name="Picture 14"/>
+            <wp:docPr id="18" name="Picture 18"/>
             <wp:cNvGraphicFramePr>
               <a:graphicFrameLocks noChangeAspect="1"/>
             </wp:cNvGraphicFramePr>
@@ -2551,7 +2759,7 @@
                     <pic:cNvPicPr/>
                   </pic:nvPicPr>
                   <pic:blipFill>
-                    <a:blip r:embed="rId22"/>
+                    <a:blip r:embed="rId26"/>
                     <a:stretch>
                       <a:fillRect/>
                     </a:stretch>
@@ -2591,7 +2799,7 @@
         <w:drawing>
           <wp:inline xmlns:a="http://schemas.openxmlformats.org/drawingml/2006/main" xmlns:pic="http://schemas.openxmlformats.org/drawingml/2006/picture">
             <wp:extent cx="5486400" cy="3657600"/>
-            <wp:docPr id="15" name="Picture 15"/>
+            <wp:docPr id="19" name="Picture 19"/>
             <wp:cNvGraphicFramePr>
               <a:graphicFrameLocks noChangeAspect="1"/>
             </wp:cNvGraphicFramePr>
@@ -2603,7 +2811,7 @@
                     <pic:cNvPicPr/>
                   </pic:nvPicPr>
                   <pic:blipFill>
-                    <a:blip r:embed="rId23"/>
+                    <a:blip r:embed="rId27"/>
                     <a:stretch>
                       <a:fillRect/>
                     </a:stretch>
@@ -2643,7 +2851,7 @@
         <w:drawing>
           <wp:inline xmlns:a="http://schemas.openxmlformats.org/drawingml/2006/main" xmlns:pic="http://schemas.openxmlformats.org/drawingml/2006/picture">
             <wp:extent cx="5486400" cy="3657600"/>
-            <wp:docPr id="16" name="Picture 16"/>
+            <wp:docPr id="20" name="Picture 20"/>
             <wp:cNvGraphicFramePr>
               <a:graphicFrameLocks noChangeAspect="1"/>
             </wp:cNvGraphicFramePr>
@@ -2655,7 +2863,7 @@
                     <pic:cNvPicPr/>
                   </pic:nvPicPr>
                   <pic:blipFill>
-                    <a:blip r:embed="rId24"/>
+                    <a:blip r:embed="rId28"/>
                     <a:stretch>
                       <a:fillRect/>
                     </a:stretch>
@@ -2695,7 +2903,7 @@
         <w:drawing>
           <wp:inline xmlns:a="http://schemas.openxmlformats.org/drawingml/2006/main" xmlns:pic="http://schemas.openxmlformats.org/drawingml/2006/picture">
             <wp:extent cx="5486400" cy="3657600"/>
-            <wp:docPr id="17" name="Picture 17"/>
+            <wp:docPr id="21" name="Picture 21"/>
             <wp:cNvGraphicFramePr>
               <a:graphicFrameLocks noChangeAspect="1"/>
             </wp:cNvGraphicFramePr>
@@ -2707,7 +2915,7 @@
                     <pic:cNvPicPr/>
                   </pic:nvPicPr>
                   <pic:blipFill>
-                    <a:blip r:embed="rId25"/>
+                    <a:blip r:embed="rId29"/>
                     <a:stretch>
                       <a:fillRect/>
                     </a:stretch>
@@ -2747,7 +2955,7 @@
         <w:drawing>
           <wp:inline xmlns:a="http://schemas.openxmlformats.org/drawingml/2006/main" xmlns:pic="http://schemas.openxmlformats.org/drawingml/2006/picture">
             <wp:extent cx="5486400" cy="3657600"/>
-            <wp:docPr id="18" name="Picture 18"/>
+            <wp:docPr id="22" name="Picture 22"/>
             <wp:cNvGraphicFramePr>
               <a:graphicFrameLocks noChangeAspect="1"/>
             </wp:cNvGraphicFramePr>
@@ -2759,7 +2967,7 @@
                     <pic:cNvPicPr/>
                   </pic:nvPicPr>
                   <pic:blipFill>
-                    <a:blip r:embed="rId26"/>
+                    <a:blip r:embed="rId30"/>
                     <a:stretch>
                       <a:fillRect/>
                     </a:stretch>
@@ -2799,7 +3007,7 @@
         <w:drawing>
           <wp:inline xmlns:a="http://schemas.openxmlformats.org/drawingml/2006/main" xmlns:pic="http://schemas.openxmlformats.org/drawingml/2006/picture">
             <wp:extent cx="5120640" cy="3413760"/>
-            <wp:docPr id="19" name="Picture 19"/>
+            <wp:docPr id="23" name="Picture 23"/>
             <wp:cNvGraphicFramePr>
               <a:graphicFrameLocks noChangeAspect="1"/>
             </wp:cNvGraphicFramePr>
@@ -2811,7 +3019,7 @@
                     <pic:cNvPicPr/>
                   </pic:nvPicPr>
                   <pic:blipFill>
-                    <a:blip r:embed="rId27"/>
+                    <a:blip r:embed="rId31"/>
                     <a:stretch>
                       <a:fillRect/>
                     </a:stretch>
@@ -2939,7 +3147,7 @@
         <w:drawing>
           <wp:inline xmlns:a="http://schemas.openxmlformats.org/drawingml/2006/main" xmlns:pic="http://schemas.openxmlformats.org/drawingml/2006/picture">
             <wp:extent cx="4754880" cy="3169920"/>
-            <wp:docPr id="20" name="Picture 20"/>
+            <wp:docPr id="24" name="Picture 24"/>
             <wp:cNvGraphicFramePr>
               <a:graphicFrameLocks noChangeAspect="1"/>
             </wp:cNvGraphicFramePr>
@@ -2951,7 +3159,7 @@
                     <pic:cNvPicPr/>
                   </pic:nvPicPr>
                   <pic:blipFill>
-                    <a:blip r:embed="rId28"/>
+                    <a:blip r:embed="rId32"/>
                     <a:stretch>
                       <a:fillRect/>
                     </a:stretch>
@@ -2991,7 +3199,7 @@
         <w:drawing>
           <wp:inline xmlns:a="http://schemas.openxmlformats.org/drawingml/2006/main" xmlns:pic="http://schemas.openxmlformats.org/drawingml/2006/picture">
             <wp:extent cx="5486400" cy="3657600"/>
-            <wp:docPr id="21" name="Picture 21"/>
+            <wp:docPr id="25" name="Picture 25"/>
             <wp:cNvGraphicFramePr>
               <a:graphicFrameLocks noChangeAspect="1"/>
             </wp:cNvGraphicFramePr>
@@ -3003,7 +3211,7 @@
                     <pic:cNvPicPr/>
                   </pic:nvPicPr>
                   <pic:blipFill>
-                    <a:blip r:embed="rId29"/>
+                    <a:blip r:embed="rId33"/>
                     <a:stretch>
                       <a:fillRect/>
                     </a:stretch>
@@ -3610,7 +3818,7 @@
         <w:drawing>
           <wp:inline xmlns:a="http://schemas.openxmlformats.org/drawingml/2006/main" xmlns:pic="http://schemas.openxmlformats.org/drawingml/2006/picture">
             <wp:extent cx="5486400" cy="3657600"/>
-            <wp:docPr id="22" name="Picture 22"/>
+            <wp:docPr id="26" name="Picture 26"/>
             <wp:cNvGraphicFramePr>
               <a:graphicFrameLocks noChangeAspect="1"/>
             </wp:cNvGraphicFramePr>
@@ -3622,7 +3830,7 @@
                     <pic:cNvPicPr/>
                   </pic:nvPicPr>
                   <pic:blipFill>
-                    <a:blip r:embed="rId30"/>
+                    <a:blip r:embed="rId34"/>
                     <a:stretch>
                       <a:fillRect/>
                     </a:stretch>
@@ -3662,7 +3870,7 @@
         <w:drawing>
           <wp:inline xmlns:a="http://schemas.openxmlformats.org/drawingml/2006/main" xmlns:pic="http://schemas.openxmlformats.org/drawingml/2006/picture">
             <wp:extent cx="5120640" cy="3413760"/>
-            <wp:docPr id="23" name="Picture 23"/>
+            <wp:docPr id="27" name="Picture 27"/>
             <wp:cNvGraphicFramePr>
               <a:graphicFrameLocks noChangeAspect="1"/>
             </wp:cNvGraphicFramePr>
@@ -3674,7 +3882,7 @@
                     <pic:cNvPicPr/>
                   </pic:nvPicPr>
                   <pic:blipFill>
-                    <a:blip r:embed="rId31"/>
+                    <a:blip r:embed="rId35"/>
                     <a:stretch>
                       <a:fillRect/>
                     </a:stretch>
@@ -3714,7 +3922,7 @@
         <w:drawing>
           <wp:inline xmlns:a="http://schemas.openxmlformats.org/drawingml/2006/main" xmlns:pic="http://schemas.openxmlformats.org/drawingml/2006/picture">
             <wp:extent cx="5120640" cy="3413760"/>
-            <wp:docPr id="24" name="Picture 24"/>
+            <wp:docPr id="28" name="Picture 28"/>
             <wp:cNvGraphicFramePr>
               <a:graphicFrameLocks noChangeAspect="1"/>
             </wp:cNvGraphicFramePr>
@@ -3726,7 +3934,7 @@
                     <pic:cNvPicPr/>
                   </pic:nvPicPr>
                   <pic:blipFill>
-                    <a:blip r:embed="rId32"/>
+                    <a:blip r:embed="rId36"/>
                     <a:stretch>
                       <a:fillRect/>
                     </a:stretch>
@@ -3766,7 +3974,7 @@
         <w:drawing>
           <wp:inline xmlns:a="http://schemas.openxmlformats.org/drawingml/2006/main" xmlns:pic="http://schemas.openxmlformats.org/drawingml/2006/picture">
             <wp:extent cx="5120640" cy="3413760"/>
-            <wp:docPr id="25" name="Picture 25"/>
+            <wp:docPr id="29" name="Picture 29"/>
             <wp:cNvGraphicFramePr>
               <a:graphicFrameLocks noChangeAspect="1"/>
             </wp:cNvGraphicFramePr>
@@ -3778,7 +3986,7 @@
                     <pic:cNvPicPr/>
                   </pic:nvPicPr>
                   <pic:blipFill>
-                    <a:blip r:embed="rId33"/>
+                    <a:blip r:embed="rId37"/>
                     <a:stretch>
                       <a:fillRect/>
                     </a:stretch>
@@ -3818,7 +4026,7 @@
         <w:drawing>
           <wp:inline xmlns:a="http://schemas.openxmlformats.org/drawingml/2006/main" xmlns:pic="http://schemas.openxmlformats.org/drawingml/2006/picture">
             <wp:extent cx="5120640" cy="3413760"/>
-            <wp:docPr id="26" name="Picture 26"/>
+            <wp:docPr id="30" name="Picture 30"/>
             <wp:cNvGraphicFramePr>
               <a:graphicFrameLocks noChangeAspect="1"/>
             </wp:cNvGraphicFramePr>
@@ -3830,7 +4038,7 @@
                     <pic:cNvPicPr/>
                   </pic:nvPicPr>
                   <pic:blipFill>
-                    <a:blip r:embed="rId34"/>
+                    <a:blip r:embed="rId38"/>
                     <a:stretch>
                       <a:fillRect/>
                     </a:stretch>
@@ -3870,7 +4078,7 @@
         <w:drawing>
           <wp:inline xmlns:a="http://schemas.openxmlformats.org/drawingml/2006/main" xmlns:pic="http://schemas.openxmlformats.org/drawingml/2006/picture">
             <wp:extent cx="5120640" cy="3413760"/>
-            <wp:docPr id="27" name="Picture 27"/>
+            <wp:docPr id="31" name="Picture 31"/>
             <wp:cNvGraphicFramePr>
               <a:graphicFrameLocks noChangeAspect="1"/>
             </wp:cNvGraphicFramePr>
@@ -3882,7 +4090,7 @@
                     <pic:cNvPicPr/>
                   </pic:nvPicPr>
                   <pic:blipFill>
-                    <a:blip r:embed="rId35"/>
+                    <a:blip r:embed="rId39"/>
                     <a:stretch>
                       <a:fillRect/>
                     </a:stretch>

</xml_diff>

<commit_message>
docs: embed real high-quality screenshot images into USER_GUIDE_v1.6
</commit_message>
<xml_diff>
--- a/USER_GUIDE_v1.6.docx
+++ b/USER_GUIDE_v1.6.docx
@@ -31,7 +31,7 @@
         </w:rPr>
         <w:t>Hệ Thống Quản Lý Cư Dân &amp; Vận Hành Khu Đô Thị Monolith</w:t>
         <w:br/>
-        <w:t>Bản hướng dẫn chi tiết theo màn hình &amp; Workflow thực tế v1.6</w:t>
+        <w:t>Bản hướng dẫn chi tiết kèm hình ảnh thực tế từ hệ thống v1.6</w:t>
       </w:r>
     </w:p>
     <w:p>
@@ -564,7 +564,197 @@
           <w:color w:val="17231F"/>
           <w:sz w:val="22"/>
         </w:rPr>
-        <w:t>Người lập phiếu đề xuất hoàn tiền cọc không được là người phê duyệt chi tiền.</w:t>
+        <w:t>Người lập phiếu đề xuất hoàn tiền cọc không được là người duyệt lệnh chi tiền.</w:t>
+      </w:r>
+    </w:p>
+    <w:p>
+      <w:pPr>
+        <w:keepNext/>
+        <w:spacing w:before="240" w:after="120"/>
+      </w:pPr>
+      <w:r>
+        <w:rPr>
+          <w:rFonts w:ascii="Playfair Display" w:hAnsi="Playfair Display"/>
+          <w:b/>
+          <w:color w:val="3E6E64"/>
+          <w:sz w:val="30"/>
+        </w:rPr>
+        <w:t>3. Hai Luồng Đăng Nhập Riêng Biệt</w:t>
+      </w:r>
+    </w:p>
+    <w:p>
+      <w:pPr>
+        <w:spacing w:after="120" w:line="276" w:lineRule="auto"/>
+      </w:pPr>
+      <w:r>
+        <w:rPr>
+          <w:rFonts w:ascii="Be Vietnam Pro" w:hAnsi="Be Vietnam Pro"/>
+          <w:i w:val="0"/>
+          <w:color w:val="17231F"/>
+          <w:sz w:val="22"/>
+        </w:rPr>
+        <w:t>Hệ thống bảo vệ nghiêm ngặt bằng hai cổng đăng nhập riêng biệt hoàn toàn:</w:t>
+      </w:r>
+    </w:p>
+    <w:p>
+      <w:pPr>
+        <w:spacing w:after="120" w:line="276" w:lineRule="auto"/>
+      </w:pPr>
+      <w:r>
+        <w:rPr>
+          <w:rFonts w:ascii="Be Vietnam Pro" w:hAnsi="Be Vietnam Pro"/>
+          <w:b/>
+          <w:color w:val="17231F"/>
+          <w:sz w:val="22"/>
+        </w:rPr>
+        <w:t xml:space="preserve">Cổng Quản trị Admin: </w:t>
+      </w:r>
+      <w:r>
+        <w:rPr>
+          <w:rFonts w:ascii="Be Vietnam Pro" w:hAnsi="Be Vietnam Pro"/>
+          <w:i w:val="0"/>
+          <w:color w:val="17231F"/>
+          <w:sz w:val="22"/>
+        </w:rPr>
+        <w:t>Dành cho nhân viên vận hành, kế toán, kỹ thuật và quản trị viên.</w:t>
+      </w:r>
+    </w:p>
+    <w:p>
+      <w:pPr>
+        <w:spacing w:before="160" w:after="80"/>
+        <w:jc w:val="center"/>
+      </w:pPr>
+      <w:r>
+        <w:drawing>
+          <wp:inline xmlns:a="http://schemas.openxmlformats.org/drawingml/2006/main" xmlns:pic="http://schemas.openxmlformats.org/drawingml/2006/picture">
+            <wp:extent cx="5029200" cy="3352800"/>
+            <wp:docPr id="1" name="Picture 1"/>
+            <wp:cNvGraphicFramePr>
+              <a:graphicFrameLocks noChangeAspect="1"/>
+            </wp:cNvGraphicFramePr>
+            <a:graphic>
+              <a:graphicData uri="http://schemas.openxmlformats.org/drawingml/2006/picture">
+                <pic:pic>
+                  <pic:nvPicPr>
+                    <pic:cNvPr id="0" name="10-admin-login.png"/>
+                    <pic:cNvPicPr/>
+                  </pic:nvPicPr>
+                  <pic:blipFill>
+                    <a:blip r:embed="rId9"/>
+                    <a:stretch>
+                      <a:fillRect/>
+                    </a:stretch>
+                  </pic:blipFill>
+                  <pic:spPr>
+                    <a:xfrm>
+                      <a:off x="0" y="0"/>
+                      <a:ext cx="5029200" cy="3352800"/>
+                    </a:xfrm>
+                    <a:prstGeom prst="rect"/>
+                  </pic:spPr>
+                </pic:pic>
+              </a:graphicData>
+            </a:graphic>
+          </wp:inline>
+        </w:drawing>
+      </w:r>
+    </w:p>
+    <w:p>
+      <w:pPr>
+        <w:spacing w:after="240"/>
+        <w:jc w:val="center"/>
+      </w:pPr>
+      <w:r>
+        <w:rPr>
+          <w:rFonts w:ascii="Be Vietnam Pro" w:hAnsi="Be Vietnam Pro"/>
+          <w:i/>
+          <w:color w:val="6E6FDF"/>
+          <w:sz w:val="19"/>
+        </w:rPr>
+        <w:t>Hình 1.1 — Giao diện đăng nhập hệ thống quản trị nội bộ</w:t>
+      </w:r>
+    </w:p>
+    <w:p>
+      <w:pPr>
+        <w:spacing w:after="120" w:line="276" w:lineRule="auto"/>
+      </w:pPr>
+      <w:r>
+        <w:rPr>
+          <w:rFonts w:ascii="Be Vietnam Pro" w:hAnsi="Be Vietnam Pro"/>
+          <w:b/>
+          <w:color w:val="17231F"/>
+          <w:sz w:val="22"/>
+        </w:rPr>
+        <w:t xml:space="preserve">Cổng Cư dân (Resident Portal): </w:t>
+      </w:r>
+      <w:r>
+        <w:rPr>
+          <w:rFonts w:ascii="Be Vietnam Pro" w:hAnsi="Be Vietnam Pro"/>
+          <w:i w:val="0"/>
+          <w:color w:val="17231F"/>
+          <w:sz w:val="22"/>
+        </w:rPr>
+        <w:t>Dành riêng cho cư dân truy cập qua Số điện thoại di động đăng ký.</w:t>
+      </w:r>
+    </w:p>
+    <w:p>
+      <w:pPr>
+        <w:spacing w:before="160" w:after="80"/>
+        <w:jc w:val="center"/>
+      </w:pPr>
+      <w:r>
+        <w:drawing>
+          <wp:inline xmlns:a="http://schemas.openxmlformats.org/drawingml/2006/main" xmlns:pic="http://schemas.openxmlformats.org/drawingml/2006/picture">
+            <wp:extent cx="5029200" cy="3352800"/>
+            <wp:docPr id="2" name="Picture 2"/>
+            <wp:cNvGraphicFramePr>
+              <a:graphicFrameLocks noChangeAspect="1"/>
+            </wp:cNvGraphicFramePr>
+            <a:graphic>
+              <a:graphicData uri="http://schemas.openxmlformats.org/drawingml/2006/picture">
+                <pic:pic>
+                  <pic:nvPicPr>
+                    <pic:cNvPr id="0" name="01-resident-login.png"/>
+                    <pic:cNvPicPr/>
+                  </pic:nvPicPr>
+                  <pic:blipFill>
+                    <a:blip r:embed="rId10"/>
+                    <a:stretch>
+                      <a:fillRect/>
+                    </a:stretch>
+                  </pic:blipFill>
+                  <pic:spPr>
+                    <a:xfrm>
+                      <a:off x="0" y="0"/>
+                      <a:ext cx="5029200" cy="3352800"/>
+                    </a:xfrm>
+                    <a:prstGeom prst="rect"/>
+                  </pic:spPr>
+                </pic:pic>
+              </a:graphicData>
+            </a:graphic>
+          </wp:inline>
+        </w:drawing>
+      </w:r>
+    </w:p>
+    <w:p>
+      <w:pPr>
+        <w:spacing w:after="240"/>
+        <w:jc w:val="center"/>
+      </w:pPr>
+      <w:r>
+        <w:rPr>
+          <w:rFonts w:ascii="Be Vietnam Pro" w:hAnsi="Be Vietnam Pro"/>
+          <w:i/>
+          <w:color w:val="6E6FDF"/>
+          <w:sz w:val="19"/>
+        </w:rPr>
+        <w:t>Hình 1.2 — Giao diện đăng nhập cổng thông tin cư dân</w:t>
+      </w:r>
+    </w:p>
+    <w:p>
+      <w:r>
+        <w:br w:type="page"/>
       </w:r>
     </w:p>
     <w:p>
@@ -668,25 +858,57 @@
     </w:p>
     <w:p>
       <w:pPr>
-        <w:spacing w:after="120" w:line="276" w:lineRule="auto"/>
+        <w:spacing w:before="160" w:after="80"/>
+        <w:jc w:val="center"/>
+      </w:pPr>
+      <w:r>
+        <w:drawing>
+          <wp:inline xmlns:a="http://schemas.openxmlformats.org/drawingml/2006/main" xmlns:pic="http://schemas.openxmlformats.org/drawingml/2006/picture">
+            <wp:extent cx="5029200" cy="3352800"/>
+            <wp:docPr id="3" name="Picture 3"/>
+            <wp:cNvGraphicFramePr>
+              <a:graphicFrameLocks noChangeAspect="1"/>
+            </wp:cNvGraphicFramePr>
+            <a:graphic>
+              <a:graphicData uri="http://schemas.openxmlformats.org/drawingml/2006/picture">
+                <pic:pic>
+                  <pic:nvPicPr>
+                    <pic:cNvPr id="0" name="11-admin-dashboard.png"/>
+                    <pic:cNvPicPr/>
+                  </pic:nvPicPr>
+                  <pic:blipFill>
+                    <a:blip r:embed="rId11"/>
+                    <a:stretch>
+                      <a:fillRect/>
+                    </a:stretch>
+                  </pic:blipFill>
+                  <pic:spPr>
+                    <a:xfrm>
+                      <a:off x="0" y="0"/>
+                      <a:ext cx="5029200" cy="3352800"/>
+                    </a:xfrm>
+                    <a:prstGeom prst="rect"/>
+                  </pic:spPr>
+                </pic:pic>
+              </a:graphicData>
+            </a:graphic>
+          </wp:inline>
+        </w:drawing>
+      </w:r>
+    </w:p>
+    <w:p>
+      <w:pPr>
+        <w:spacing w:after="240"/>
+        <w:jc w:val="center"/>
       </w:pPr>
       <w:r>
         <w:rPr>
           <w:rFonts w:ascii="Be Vietnam Pro" w:hAnsi="Be Vietnam Pro"/>
-          <w:b/>
-          <w:color w:val="17231F"/>
-          <w:sz w:val="22"/>
+          <w:i/>
+          <w:color w:val="6E6FDF"/>
+          <w:sz w:val="19"/>
         </w:rPr>
-        <w:t xml:space="preserve">• </w:t>
-      </w:r>
-      <w:r>
-        <w:rPr>
-          <w:rFonts w:ascii="Be Vietnam Pro" w:hAnsi="Be Vietnam Pro"/>
-          <w:i w:val="0"/>
-          <w:color w:val="17231F"/>
-          <w:sz w:val="22"/>
-        </w:rPr>
-        <w:t>Trạng thái trống (Empty State): Khi không có dữ liệu phù hợp bộ lọc, hệ thống hiển thị hình ảnh minh họa nhẹ nhàng kèm nút gợi ý hành động, tránh làm đơ giao diện.</w:t>
+        <w:t>Hình 2.1 — Bảng điều khiển tổng quan quản trị</w:t>
       </w:r>
     </w:p>
     <w:p>
@@ -743,25 +965,57 @@
     </w:p>
     <w:p>
       <w:pPr>
-        <w:spacing w:after="120" w:line="276" w:lineRule="auto"/>
+        <w:spacing w:before="160" w:after="80"/>
+        <w:jc w:val="center"/>
+      </w:pPr>
+      <w:r>
+        <w:drawing>
+          <wp:inline xmlns:a="http://schemas.openxmlformats.org/drawingml/2006/main" xmlns:pic="http://schemas.openxmlformats.org/drawingml/2006/picture">
+            <wp:extent cx="5029200" cy="3352800"/>
+            <wp:docPr id="4" name="Picture 4"/>
+            <wp:cNvGraphicFramePr>
+              <a:graphicFrameLocks noChangeAspect="1"/>
+            </wp:cNvGraphicFramePr>
+            <a:graphic>
+              <a:graphicData uri="http://schemas.openxmlformats.org/drawingml/2006/picture">
+                <pic:pic>
+                  <pic:nvPicPr>
+                    <pic:cNvPr id="0" name="21-admin-CnH.png"/>
+                    <pic:cNvPicPr/>
+                  </pic:nvPicPr>
+                  <pic:blipFill>
+                    <a:blip r:embed="rId12"/>
+                    <a:stretch>
+                      <a:fillRect/>
+                    </a:stretch>
+                  </pic:blipFill>
+                  <pic:spPr>
+                    <a:xfrm>
+                      <a:off x="0" y="0"/>
+                      <a:ext cx="5029200" cy="3352800"/>
+                    </a:xfrm>
+                    <a:prstGeom prst="rect"/>
+                  </pic:spPr>
+                </pic:pic>
+              </a:graphicData>
+            </a:graphic>
+          </wp:inline>
+        </w:drawing>
+      </w:r>
+    </w:p>
+    <w:p>
+      <w:pPr>
+        <w:spacing w:after="240"/>
+        <w:jc w:val="center"/>
       </w:pPr>
       <w:r>
         <w:rPr>
           <w:rFonts w:ascii="Be Vietnam Pro" w:hAnsi="Be Vietnam Pro"/>
-          <w:b/>
-          <w:color w:val="17231F"/>
-          <w:sz w:val="22"/>
+          <w:i/>
+          <w:color w:val="6E6FDF"/>
+          <w:sz w:val="19"/>
         </w:rPr>
-        <w:t xml:space="preserve">• </w:t>
-      </w:r>
-      <w:r>
-        <w:rPr>
-          <w:rFonts w:ascii="Be Vietnam Pro" w:hAnsi="Be Vietnam Pro"/>
-          <w:i w:val="0"/>
-          <w:color w:val="17231F"/>
-          <w:sz w:val="22"/>
-        </w:rPr>
-        <w:t>Thao tác: Thêm mới căn hộ, Chỉnh sửa thông tin chi tiết, hoặc xuất biên bản bàn giao bàn kỹ thuật.</w:t>
+        <w:t>Hình 2.2 — Danh sách căn hộ dạng lưới (Card Inventory)</w:t>
       </w:r>
     </w:p>
     <w:p>
@@ -818,6 +1072,61 @@
     </w:p>
     <w:p>
       <w:pPr>
+        <w:spacing w:before="160" w:after="80"/>
+        <w:jc w:val="center"/>
+      </w:pPr>
+      <w:r>
+        <w:drawing>
+          <wp:inline xmlns:a="http://schemas.openxmlformats.org/drawingml/2006/main" xmlns:pic="http://schemas.openxmlformats.org/drawingml/2006/picture">
+            <wp:extent cx="5029200" cy="3352800"/>
+            <wp:docPr id="5" name="Picture 5"/>
+            <wp:cNvGraphicFramePr>
+              <a:graphicFrameLocks noChangeAspect="1"/>
+            </wp:cNvGraphicFramePr>
+            <a:graphic>
+              <a:graphicData uri="http://schemas.openxmlformats.org/drawingml/2006/picture">
+                <pic:pic>
+                  <pic:nvPicPr>
+                    <pic:cNvPr id="0" name="21-admin-CDn.png"/>
+                    <pic:cNvPicPr/>
+                  </pic:nvPicPr>
+                  <pic:blipFill>
+                    <a:blip r:embed="rId13"/>
+                    <a:stretch>
+                      <a:fillRect/>
+                    </a:stretch>
+                  </pic:blipFill>
+                  <pic:spPr>
+                    <a:xfrm>
+                      <a:off x="0" y="0"/>
+                      <a:ext cx="5029200" cy="3352800"/>
+                    </a:xfrm>
+                    <a:prstGeom prst="rect"/>
+                  </pic:spPr>
+                </pic:pic>
+              </a:graphicData>
+            </a:graphic>
+          </wp:inline>
+        </w:drawing>
+      </w:r>
+    </w:p>
+    <w:p>
+      <w:pPr>
+        <w:spacing w:after="240"/>
+        <w:jc w:val="center"/>
+      </w:pPr>
+      <w:r>
+        <w:rPr>
+          <w:rFonts w:ascii="Be Vietnam Pro" w:hAnsi="Be Vietnam Pro"/>
+          <w:i/>
+          <w:color w:val="6E6FDF"/>
+          <w:sz w:val="19"/>
+        </w:rPr>
+        <w:t>Hình 2.3 — Phân hệ quản lý thông tin cư dân</w:t>
+      </w:r>
+    </w:p>
+    <w:p>
+      <w:pPr>
         <w:spacing w:after="120" w:line="276" w:lineRule="auto"/>
       </w:pPr>
       <w:r>
@@ -837,6 +1146,61 @@
           <w:sz w:val="22"/>
         </w:rPr>
         <w:t>Tài khoản cổng cư dân: Quản trị viên có thể xem Danh sách tài khoản cư dân, Reset mật khẩu về mặc định (Abc@12345), và xem Ma trận phân quyền (Read-only, vai trò RESIDENT) để đảm bảo tính minh bạch.</w:t>
+      </w:r>
+    </w:p>
+    <w:p>
+      <w:pPr>
+        <w:spacing w:before="160" w:after="80"/>
+        <w:jc w:val="center"/>
+      </w:pPr>
+      <w:r>
+        <w:drawing>
+          <wp:inline xmlns:a="http://schemas.openxmlformats.org/drawingml/2006/main" xmlns:pic="http://schemas.openxmlformats.org/drawingml/2006/picture">
+            <wp:extent cx="5029200" cy="3352800"/>
+            <wp:docPr id="6" name="Picture 6"/>
+            <wp:cNvGraphicFramePr>
+              <a:graphicFrameLocks noChangeAspect="1"/>
+            </wp:cNvGraphicFramePr>
+            <a:graphic>
+              <a:graphicData uri="http://schemas.openxmlformats.org/drawingml/2006/picture">
+                <pic:pic>
+                  <pic:nvPicPr>
+                    <pic:cNvPr id="0" name="15-admin-permission-matrix.png"/>
+                    <pic:cNvPicPr/>
+                  </pic:nvPicPr>
+                  <pic:blipFill>
+                    <a:blip r:embed="rId14"/>
+                    <a:stretch>
+                      <a:fillRect/>
+                    </a:stretch>
+                  </pic:blipFill>
+                  <pic:spPr>
+                    <a:xfrm>
+                      <a:off x="0" y="0"/>
+                      <a:ext cx="5029200" cy="3352800"/>
+                    </a:xfrm>
+                    <a:prstGeom prst="rect"/>
+                  </pic:spPr>
+                </pic:pic>
+              </a:graphicData>
+            </a:graphic>
+          </wp:inline>
+        </w:drawing>
+      </w:r>
+    </w:p>
+    <w:p>
+      <w:pPr>
+        <w:spacing w:after="240"/>
+        <w:jc w:val="center"/>
+      </w:pPr>
+      <w:r>
+        <w:rPr>
+          <w:rFonts w:ascii="Be Vietnam Pro" w:hAnsi="Be Vietnam Pro"/>
+          <w:i/>
+          <w:color w:val="6E6FDF"/>
+          <w:sz w:val="19"/>
+        </w:rPr>
+        <w:t>Hình 2.4 — Ma trận kiểm tra chi tiết quyền cư dân</w:t>
       </w:r>
     </w:p>
     <w:p>
@@ -893,6 +1257,61 @@
     </w:p>
     <w:p>
       <w:pPr>
+        <w:spacing w:before="160" w:after="80"/>
+        <w:jc w:val="center"/>
+      </w:pPr>
+      <w:r>
+        <w:drawing>
+          <wp:inline xmlns:a="http://schemas.openxmlformats.org/drawingml/2006/main" xmlns:pic="http://schemas.openxmlformats.org/drawingml/2006/picture">
+            <wp:extent cx="5029200" cy="3352800"/>
+            <wp:docPr id="7" name="Picture 7"/>
+            <wp:cNvGraphicFramePr>
+              <a:graphicFrameLocks noChangeAspect="1"/>
+            </wp:cNvGraphicFramePr>
+            <a:graphic>
+              <a:graphicData uri="http://schemas.openxmlformats.org/drawingml/2006/picture">
+                <pic:pic>
+                  <pic:nvPicPr>
+                    <pic:cNvPr id="0" name="21-admin-QunLinNc.png"/>
+                    <pic:cNvPicPr/>
+                  </pic:nvPicPr>
+                  <pic:blipFill>
+                    <a:blip r:embed="rId15"/>
+                    <a:stretch>
+                      <a:fillRect/>
+                    </a:stretch>
+                  </pic:blipFill>
+                  <pic:spPr>
+                    <a:xfrm>
+                      <a:off x="0" y="0"/>
+                      <a:ext cx="5029200" cy="3352800"/>
+                    </a:xfrm>
+                    <a:prstGeom prst="rect"/>
+                  </pic:spPr>
+                </pic:pic>
+              </a:graphicData>
+            </a:graphic>
+          </wp:inline>
+        </w:drawing>
+      </w:r>
+    </w:p>
+    <w:p>
+      <w:pPr>
+        <w:spacing w:after="240"/>
+        <w:jc w:val="center"/>
+      </w:pPr>
+      <w:r>
+        <w:rPr>
+          <w:rFonts w:ascii="Be Vietnam Pro" w:hAnsi="Be Vietnam Pro"/>
+          <w:i/>
+          <w:color w:val="6E6FDF"/>
+          <w:sz w:val="19"/>
+        </w:rPr>
+        <w:t>Hình 2.5 — Quản lý công tơ và hóa đơn điện nước</w:t>
+      </w:r>
+    </w:p>
+    <w:p>
+      <w:pPr>
         <w:spacing w:after="120" w:line="276" w:lineRule="auto"/>
       </w:pPr>
       <w:r>
@@ -912,6 +1331,61 @@
           <w:sz w:val="22"/>
         </w:rPr>
         <w:t>Ghi chỉ số di động bằng AI (Technician Meter): Kỹ thuật viên dùng điện thoại chụp ảnh công tơ thực tế. Mô-đun AI quét ảnh, tự động nhận diện chỉ số bằng OCR và điền vào form, giúp tăng 95% độ chính xác.</w:t>
+      </w:r>
+    </w:p>
+    <w:p>
+      <w:pPr>
+        <w:spacing w:before="160" w:after="80"/>
+        <w:jc w:val="center"/>
+      </w:pPr>
+      <w:r>
+        <w:drawing>
+          <wp:inline xmlns:a="http://schemas.openxmlformats.org/drawingml/2006/main" xmlns:pic="http://schemas.openxmlformats.org/drawingml/2006/picture">
+            <wp:extent cx="5029200" cy="3352800"/>
+            <wp:docPr id="8" name="Picture 8"/>
+            <wp:cNvGraphicFramePr>
+              <a:graphicFrameLocks noChangeAspect="1"/>
+            </wp:cNvGraphicFramePr>
+            <a:graphic>
+              <a:graphicData uri="http://schemas.openxmlformats.org/drawingml/2006/picture">
+                <pic:pic>
+                  <pic:nvPicPr>
+                    <pic:cNvPr id="0" name="22-admin-GhiChSMobile.png"/>
+                    <pic:cNvPicPr/>
+                  </pic:nvPicPr>
+                  <pic:blipFill>
+                    <a:blip r:embed="rId16"/>
+                    <a:stretch>
+                      <a:fillRect/>
+                    </a:stretch>
+                  </pic:blipFill>
+                  <pic:spPr>
+                    <a:xfrm>
+                      <a:off x="0" y="0"/>
+                      <a:ext cx="5029200" cy="3352800"/>
+                    </a:xfrm>
+                    <a:prstGeom prst="rect"/>
+                  </pic:spPr>
+                </pic:pic>
+              </a:graphicData>
+            </a:graphic>
+          </wp:inline>
+        </w:drawing>
+      </w:r>
+    </w:p>
+    <w:p>
+      <w:pPr>
+        <w:spacing w:after="240"/>
+        <w:jc w:val="center"/>
+      </w:pPr>
+      <w:r>
+        <w:rPr>
+          <w:rFonts w:ascii="Be Vietnam Pro" w:hAnsi="Be Vietnam Pro"/>
+          <w:i/>
+          <w:color w:val="6E6FDF"/>
+          <w:sz w:val="19"/>
+        </w:rPr>
+        <w:t>Hình 2.6 — Ghi chỉ số di động với camera AI hỗ trợ OCR</w:t>
       </w:r>
     </w:p>
     <w:p>
@@ -968,48 +1442,57 @@
     </w:p>
     <w:p>
       <w:pPr>
-        <w:spacing w:after="120" w:line="276" w:lineRule="auto"/>
+        <w:spacing w:before="160" w:after="80"/>
+        <w:jc w:val="center"/>
+      </w:pPr>
+      <w:r>
+        <w:drawing>
+          <wp:inline xmlns:a="http://schemas.openxmlformats.org/drawingml/2006/main" xmlns:pic="http://schemas.openxmlformats.org/drawingml/2006/picture">
+            <wp:extent cx="5029200" cy="3352800"/>
+            <wp:docPr id="9" name="Picture 9"/>
+            <wp:cNvGraphicFramePr>
+              <a:graphicFrameLocks noChangeAspect="1"/>
+            </wp:cNvGraphicFramePr>
+            <a:graphic>
+              <a:graphicData uri="http://schemas.openxmlformats.org/drawingml/2006/picture">
+                <pic:pic>
+                  <pic:nvPicPr>
+                    <pic:cNvPr id="0" name="21-admin-HanTngHp.png"/>
+                    <pic:cNvPicPr/>
+                  </pic:nvPicPr>
+                  <pic:blipFill>
+                    <a:blip r:embed="rId17"/>
+                    <a:stretch>
+                      <a:fillRect/>
+                    </a:stretch>
+                  </pic:blipFill>
+                  <pic:spPr>
+                    <a:xfrm>
+                      <a:off x="0" y="0"/>
+                      <a:ext cx="5029200" cy="3352800"/>
+                    </a:xfrm>
+                    <a:prstGeom prst="rect"/>
+                  </pic:spPr>
+                </pic:pic>
+              </a:graphicData>
+            </a:graphic>
+          </wp:inline>
+        </w:drawing>
+      </w:r>
+    </w:p>
+    <w:p>
+      <w:pPr>
+        <w:spacing w:after="240"/>
+        <w:jc w:val="center"/>
       </w:pPr>
       <w:r>
         <w:rPr>
           <w:rFonts w:ascii="Be Vietnam Pro" w:hAnsi="Be Vietnam Pro"/>
-          <w:b/>
-          <w:color w:val="17231F"/>
-          <w:sz w:val="22"/>
+          <w:i/>
+          <w:color w:val="6E6FDF"/>
+          <w:sz w:val="19"/>
         </w:rPr>
-        <w:t xml:space="preserve">• </w:t>
-      </w:r>
-      <w:r>
-        <w:rPr>
-          <w:rFonts w:ascii="Be Vietnam Pro" w:hAnsi="Be Vietnam Pro"/>
-          <w:i w:val="0"/>
-          <w:color w:val="17231F"/>
-          <w:sz w:val="22"/>
-        </w:rPr>
-        <w:t>Đối soát tự động SePay Webhook: Hóa đơn tích hợp mã QR VietQR động. Khi cư dân chuyển khoản đúng số tiền và nội dung (chứa mã căn hộ), SePay Webhook lập tức gửi tín hiệu về backend. Hệ thống tự động gạch nợ trạng thái PAID, gửi thông báo xác nhận cho cư dân trong vòng 2 giây.</w:t>
-      </w:r>
-    </w:p>
-    <w:p>
-      <w:pPr>
-        <w:spacing w:after="120" w:line="276" w:lineRule="auto"/>
-      </w:pPr>
-      <w:r>
-        <w:rPr>
-          <w:rFonts w:ascii="Be Vietnam Pro" w:hAnsi="Be Vietnam Pro"/>
-          <w:b/>
-          <w:color w:val="17231F"/>
-          <w:sz w:val="22"/>
-        </w:rPr>
-        <w:t xml:space="preserve">• </w:t>
-      </w:r>
-      <w:r>
-        <w:rPr>
-          <w:rFonts w:ascii="Be Vietnam Pro" w:hAnsi="Be Vietnam Pro"/>
-          <w:i w:val="0"/>
-          <w:color w:val="17231F"/>
-          <w:sz w:val="22"/>
-        </w:rPr>
-        <w:t>Xuất hóa đơn VNPT E-Invoice: Hóa đơn sau khi thanh toán được ký số và đồng bộ trực tiếp lên hệ thống VNPT Invoice phục vụ báo cáo thuế.</w:t>
+        <w:t>Hình 2.7 — Quản lý kỳ phí và lập hóa đơn tổng hợp</w:t>
       </w:r>
     </w:p>
     <w:p>
@@ -1066,25 +1549,57 @@
     </w:p>
     <w:p>
       <w:pPr>
-        <w:spacing w:after="120" w:line="276" w:lineRule="auto"/>
+        <w:spacing w:before="160" w:after="80"/>
+        <w:jc w:val="center"/>
+      </w:pPr>
+      <w:r>
+        <w:drawing>
+          <wp:inline xmlns:a="http://schemas.openxmlformats.org/drawingml/2006/main" xmlns:pic="http://schemas.openxmlformats.org/drawingml/2006/picture">
+            <wp:extent cx="5029200" cy="3352800"/>
+            <wp:docPr id="10" name="Picture 10"/>
+            <wp:cNvGraphicFramePr>
+              <a:graphicFrameLocks noChangeAspect="1"/>
+            </wp:cNvGraphicFramePr>
+            <a:graphic>
+              <a:graphicData uri="http://schemas.openxmlformats.org/drawingml/2006/picture">
+                <pic:pic>
+                  <pic:nvPicPr>
+                    <pic:cNvPr id="0" name="21-admin-Tinch.png"/>
+                    <pic:cNvPicPr/>
+                  </pic:nvPicPr>
+                  <pic:blipFill>
+                    <a:blip r:embed="rId18"/>
+                    <a:stretch>
+                      <a:fillRect/>
+                    </a:stretch>
+                  </pic:blipFill>
+                  <pic:spPr>
+                    <a:xfrm>
+                      <a:off x="0" y="0"/>
+                      <a:ext cx="5029200" cy="3352800"/>
+                    </a:xfrm>
+                    <a:prstGeom prst="rect"/>
+                  </pic:spPr>
+                </pic:pic>
+              </a:graphicData>
+            </a:graphic>
+          </wp:inline>
+        </w:drawing>
+      </w:r>
+    </w:p>
+    <w:p>
+      <w:pPr>
+        <w:spacing w:after="240"/>
+        <w:jc w:val="center"/>
       </w:pPr>
       <w:r>
         <w:rPr>
           <w:rFonts w:ascii="Be Vietnam Pro" w:hAnsi="Be Vietnam Pro"/>
-          <w:b/>
-          <w:color w:val="17231F"/>
-          <w:sz w:val="22"/>
+          <w:i/>
+          <w:color w:val="6E6FDF"/>
+          <w:sz w:val="19"/>
         </w:rPr>
-        <w:t xml:space="preserve">• </w:t>
-      </w:r>
-      <w:r>
-        <w:rPr>
-          <w:rFonts w:ascii="Be Vietnam Pro" w:hAnsi="Be Vietnam Pro"/>
-          <w:i w:val="0"/>
-          <w:color w:val="17231F"/>
-          <w:sz w:val="22"/>
-        </w:rPr>
-        <w:t>Xử lý đặt chỗ: Duyệt/Từ chối hoặc hủy lịch đặt của cư dân kèm ghi nhận lý do chi tiết.</w:t>
+        <w:t>Hình 2.8 — Danh sách đặt chỗ tiện ích chung</w:t>
       </w:r>
     </w:p>
     <w:p>
@@ -1141,25 +1656,57 @@
     </w:p>
     <w:p>
       <w:pPr>
-        <w:spacing w:after="120" w:line="276" w:lineRule="auto"/>
+        <w:spacing w:before="160" w:after="80"/>
+        <w:jc w:val="center"/>
+      </w:pPr>
+      <w:r>
+        <w:drawing>
+          <wp:inline xmlns:a="http://schemas.openxmlformats.org/drawingml/2006/main" xmlns:pic="http://schemas.openxmlformats.org/drawingml/2006/picture">
+            <wp:extent cx="5029200" cy="3352800"/>
+            <wp:docPr id="11" name="Picture 11"/>
+            <wp:cNvGraphicFramePr>
+              <a:graphicFrameLocks noChangeAspect="1"/>
+            </wp:cNvGraphicFramePr>
+            <a:graphic>
+              <a:graphicData uri="http://schemas.openxmlformats.org/drawingml/2006/picture">
+                <pic:pic>
+                  <pic:nvPicPr>
+                    <pic:cNvPr id="0" name="22-admin-ThiCong.png"/>
+                    <pic:cNvPicPr/>
+                  </pic:nvPicPr>
+                  <pic:blipFill>
+                    <a:blip r:embed="rId19"/>
+                    <a:stretch>
+                      <a:fillRect/>
+                    </a:stretch>
+                  </pic:blipFill>
+                  <pic:spPr>
+                    <a:xfrm>
+                      <a:off x="0" y="0"/>
+                      <a:ext cx="5029200" cy="3352800"/>
+                    </a:xfrm>
+                    <a:prstGeom prst="rect"/>
+                  </pic:spPr>
+                </pic:pic>
+              </a:graphicData>
+            </a:graphic>
+          </wp:inline>
+        </w:drawing>
+      </w:r>
+    </w:p>
+    <w:p>
+      <w:pPr>
+        <w:spacing w:after="240"/>
+        <w:jc w:val="center"/>
       </w:pPr>
       <w:r>
         <w:rPr>
           <w:rFonts w:ascii="Be Vietnam Pro" w:hAnsi="Be Vietnam Pro"/>
-          <w:b/>
-          <w:color w:val="17231F"/>
-          <w:sz w:val="22"/>
+          <w:i/>
+          <w:color w:val="6E6FDF"/>
+          <w:sz w:val="19"/>
         </w:rPr>
-        <w:t xml:space="preserve">• </w:t>
-      </w:r>
-      <w:r>
-        <w:rPr>
-          <w:rFonts w:ascii="Be Vietnam Pro" w:hAnsi="Be Vietnam Pro"/>
-          <w:i w:val="0"/>
-          <w:color w:val="17231F"/>
-          <w:sz w:val="22"/>
-        </w:rPr>
-        <w:t>Ký quỹ hoàn thiện: Quản lý khoản tiền đặt cọc thi công (chuẩn 100,000,000 VNĐ). Tiền chỉ được hoàn trả sau khi phòng Kỹ thuật nghiệm thu không có lỗi vi phạm kết cấu chung.</w:t>
+        <w:t>Hình 2.9 — Danh sách đăng ký sửa chữa cải tạo căn hộ</w:t>
       </w:r>
     </w:p>
     <w:p>
@@ -1211,99 +1758,62 @@
           <w:color w:val="17231F"/>
           <w:sz w:val="22"/>
         </w:rPr>
-        <w:t>Lead Pipeline (Kanban): Theo dõi cơ hội kinh doanh qua các bước Nhận Lead -&gt; Chăm sóc -&gt; Giữ chỗ.</w:t>
-      </w:r>
-    </w:p>
-    <w:p>
-      <w:pPr>
-        <w:spacing w:after="120" w:line="276" w:lineRule="auto"/>
-      </w:pPr>
-      <w:r>
-        <w:rPr>
-          <w:rFonts w:ascii="Be Vietnam Pro" w:hAnsi="Be Vietnam Pro"/>
-          <w:b/>
-          <w:color w:val="17231F"/>
-          <w:sz w:val="22"/>
-        </w:rPr>
-        <w:t xml:space="preserve">• </w:t>
-      </w:r>
-      <w:r>
-        <w:rPr>
-          <w:rFonts w:ascii="Be Vietnam Pro" w:hAnsi="Be Vietnam Pro"/>
-          <w:i w:val="0"/>
-          <w:color w:val="17231F"/>
-          <w:sz w:val="22"/>
-        </w:rPr>
         <w:t>Sales Matrix: Bản đồ giỏ hàng bất động sản theo thời gian thực (Trống, Đã giữ chỗ, Đã cọc, Đã ký HĐMB).</w:t>
       </w:r>
     </w:p>
     <w:p>
       <w:pPr>
-        <w:spacing w:after="120" w:line="276" w:lineRule="auto"/>
+        <w:spacing w:before="160" w:after="80"/>
+        <w:jc w:val="center"/>
+      </w:pPr>
+      <w:r>
+        <w:drawing>
+          <wp:inline xmlns:a="http://schemas.openxmlformats.org/drawingml/2006/main" xmlns:pic="http://schemas.openxmlformats.org/drawingml/2006/picture">
+            <wp:extent cx="5029200" cy="3352800"/>
+            <wp:docPr id="12" name="Picture 12"/>
+            <wp:cNvGraphicFramePr>
+              <a:graphicFrameLocks noChangeAspect="1"/>
+            </wp:cNvGraphicFramePr>
+            <a:graphic>
+              <a:graphicData uri="http://schemas.openxmlformats.org/drawingml/2006/picture">
+                <pic:pic>
+                  <pic:nvPicPr>
+                    <pic:cNvPr id="0" name="21-admin-KinhDoanhCRM.png"/>
+                    <pic:cNvPicPr/>
+                  </pic:nvPicPr>
+                  <pic:blipFill>
+                    <a:blip r:embed="rId20"/>
+                    <a:stretch>
+                      <a:fillRect/>
+                    </a:stretch>
+                  </pic:blipFill>
+                  <pic:spPr>
+                    <a:xfrm>
+                      <a:off x="0" y="0"/>
+                      <a:ext cx="5029200" cy="3352800"/>
+                    </a:xfrm>
+                    <a:prstGeom prst="rect"/>
+                  </pic:spPr>
+                </pic:pic>
+              </a:graphicData>
+            </a:graphic>
+          </wp:inline>
+        </w:drawing>
+      </w:r>
+    </w:p>
+    <w:p>
+      <w:pPr>
+        <w:spacing w:after="240"/>
+        <w:jc w:val="center"/>
       </w:pPr>
       <w:r>
         <w:rPr>
           <w:rFonts w:ascii="Be Vietnam Pro" w:hAnsi="Be Vietnam Pro"/>
-          <w:b/>
-          <w:color w:val="17231F"/>
-          <w:sz w:val="22"/>
+          <w:i/>
+          <w:color w:val="6E6FDF"/>
+          <w:sz w:val="19"/>
         </w:rPr>
-        <w:t xml:space="preserve">• </w:t>
-      </w:r>
-      <w:r>
-        <w:rPr>
-          <w:rFonts w:ascii="Be Vietnam Pro" w:hAnsi="Be Vietnam Pro"/>
-          <w:i w:val="0"/>
-          <w:color w:val="17231F"/>
-          <w:sz w:val="22"/>
-        </w:rPr>
-        <w:t>Hợp đồng Mua bán (HĐMB): Quản lý mẫu hợp đồng chuẩn 18 điều khoản, tự động tính toán 10 đợt thanh toán (LTT) định kỳ.</w:t>
-      </w:r>
-    </w:p>
-    <w:p>
-      <w:pPr>
-        <w:spacing w:after="120" w:line="276" w:lineRule="auto"/>
-      </w:pPr>
-      <w:r>
-        <w:rPr>
-          <w:rFonts w:ascii="Be Vietnam Pro" w:hAnsi="Be Vietnam Pro"/>
-          <w:b/>
-          <w:color w:val="17231F"/>
-          <w:sz w:val="22"/>
-        </w:rPr>
-        <w:t xml:space="preserve">• </w:t>
-      </w:r>
-      <w:r>
-        <w:rPr>
-          <w:rFonts w:ascii="Be Vietnam Pro" w:hAnsi="Be Vietnam Pro"/>
-          <w:i w:val="0"/>
-          <w:color w:val="17231F"/>
-          <w:sz w:val="22"/>
-        </w:rPr>
-        <w:t>Tính toán thanh toán sớm: Áp dụng các mốc chiết khấu lãi suất khi khách hàng nộp tiền trước hạn.</w:t>
-      </w:r>
-    </w:p>
-    <w:p>
-      <w:pPr>
-        <w:spacing w:after="120" w:line="276" w:lineRule="auto"/>
-      </w:pPr>
-      <w:r>
-        <w:rPr>
-          <w:rFonts w:ascii="Be Vietnam Pro" w:hAnsi="Be Vietnam Pro"/>
-          <w:b/>
-          <w:color w:val="17231F"/>
-          <w:sz w:val="22"/>
-        </w:rPr>
-        <w:t xml:space="preserve">• </w:t>
-      </w:r>
-      <w:r>
-        <w:rPr>
-          <w:rFonts w:ascii="Be Vietnam Pro" w:hAnsi="Be Vietnam Pro"/>
-          <w:i w:val="0"/>
-          <w:color w:val="17231F"/>
-          <w:sz w:val="22"/>
-        </w:rPr>
-        <w:t>Chuyển nhượng HĐMB (B.7): Quy trình thẩm định chuyển nhượng phức tạp. Tự động kiểm tra nợ quá hạn, tính phí chuyển nhượng, và đặc biệt tự động kế thừa lịch thanh toán (LTT) nguyên vẹn sang chủ mới.</w:t>
+        <w:t>Hình 2.10 — Phân hệ quản lý bán hàng CRM</w:t>
       </w:r>
     </w:p>
     <w:p>
@@ -1327,6 +1837,66 @@
           <w:sz w:val="22"/>
         </w:rPr>
         <w:t>Báo cáo &amp; KPI Bán hàng (B.10): Biểu đồ phễu chuyển đổi (Leads -&gt; Bookings -&gt; Deposits -&gt; Contracts -&gt; Handovers) và bảng đánh giá KPI nhân viên kinh doanh, hỗ trợ xuất báo cáo Excel chuẩn E.3/E.4.</w:t>
+      </w:r>
+    </w:p>
+    <w:p>
+      <w:pPr>
+        <w:spacing w:before="160" w:after="80"/>
+        <w:jc w:val="center"/>
+      </w:pPr>
+      <w:r>
+        <w:drawing>
+          <wp:inline xmlns:a="http://schemas.openxmlformats.org/drawingml/2006/main" xmlns:pic="http://schemas.openxmlformats.org/drawingml/2006/picture">
+            <wp:extent cx="5029200" cy="3352800"/>
+            <wp:docPr id="13" name="Picture 13"/>
+            <wp:cNvGraphicFramePr>
+              <a:graphicFrameLocks noChangeAspect="1"/>
+            </wp:cNvGraphicFramePr>
+            <a:graphic>
+              <a:graphicData uri="http://schemas.openxmlformats.org/drawingml/2006/picture">
+                <pic:pic>
+                  <pic:nvPicPr>
+                    <pic:cNvPr id="0" name="22-admin-BoCoKPIiuHnh.png"/>
+                    <pic:cNvPicPr/>
+                  </pic:nvPicPr>
+                  <pic:blipFill>
+                    <a:blip r:embed="rId21"/>
+                    <a:stretch>
+                      <a:fillRect/>
+                    </a:stretch>
+                  </pic:blipFill>
+                  <pic:spPr>
+                    <a:xfrm>
+                      <a:off x="0" y="0"/>
+                      <a:ext cx="5029200" cy="3352800"/>
+                    </a:xfrm>
+                    <a:prstGeom prst="rect"/>
+                  </pic:spPr>
+                </pic:pic>
+              </a:graphicData>
+            </a:graphic>
+          </wp:inline>
+        </w:drawing>
+      </w:r>
+    </w:p>
+    <w:p>
+      <w:pPr>
+        <w:spacing w:after="240"/>
+        <w:jc w:val="center"/>
+      </w:pPr>
+      <w:r>
+        <w:rPr>
+          <w:rFonts w:ascii="Be Vietnam Pro" w:hAnsi="Be Vietnam Pro"/>
+          <w:i/>
+          <w:color w:val="6E6FDF"/>
+          <w:sz w:val="19"/>
+        </w:rPr>
+        <w:t>Hình 2.11 — Báo cáo phân tích KPI điều hành</w:t>
+      </w:r>
+    </w:p>
+    <w:p>
+      <w:r>
+        <w:br w:type="page"/>
       </w:r>
     </w:p>
     <w:p>
@@ -1398,6 +1968,61 @@
     </w:p>
     <w:p>
       <w:pPr>
+        <w:spacing w:before="160" w:after="80"/>
+        <w:jc w:val="center"/>
+      </w:pPr>
+      <w:r>
+        <w:drawing>
+          <wp:inline xmlns:a="http://schemas.openxmlformats.org/drawingml/2006/main" xmlns:pic="http://schemas.openxmlformats.org/drawingml/2006/picture">
+            <wp:extent cx="5029200" cy="3352800"/>
+            <wp:docPr id="14" name="Picture 14"/>
+            <wp:cNvGraphicFramePr>
+              <a:graphicFrameLocks noChangeAspect="1"/>
+            </wp:cNvGraphicFramePr>
+            <a:graphic>
+              <a:graphicData uri="http://schemas.openxmlformats.org/drawingml/2006/picture">
+                <pic:pic>
+                  <pic:nvPicPr>
+                    <pic:cNvPr id="0" name="02-resident-portal-onboard.png"/>
+                    <pic:cNvPicPr/>
+                  </pic:nvPicPr>
+                  <pic:blipFill>
+                    <a:blip r:embed="rId22"/>
+                    <a:stretch>
+                      <a:fillRect/>
+                    </a:stretch>
+                  </pic:blipFill>
+                  <pic:spPr>
+                    <a:xfrm>
+                      <a:off x="0" y="0"/>
+                      <a:ext cx="5029200" cy="3352800"/>
+                    </a:xfrm>
+                    <a:prstGeom prst="rect"/>
+                  </pic:spPr>
+                </pic:pic>
+              </a:graphicData>
+            </a:graphic>
+          </wp:inline>
+        </w:drawing>
+      </w:r>
+    </w:p>
+    <w:p>
+      <w:pPr>
+        <w:spacing w:after="240"/>
+        <w:jc w:val="center"/>
+      </w:pPr>
+      <w:r>
+        <w:rPr>
+          <w:rFonts w:ascii="Be Vietnam Pro" w:hAnsi="Be Vietnam Pro"/>
+          <w:i/>
+          <w:color w:val="6E6FDF"/>
+          <w:sz w:val="19"/>
+        </w:rPr>
+        <w:t>Hình 3.1 — Wizard chào mừng cư dân đăng nhập lần đầu</w:t>
+      </w:r>
+    </w:p>
+    <w:p>
+      <w:pPr>
         <w:keepNext/>
         <w:spacing w:before="240" w:after="120"/>
       </w:pPr>
@@ -1408,7 +2033,91 @@
           <w:color w:val="3E6E64"/>
           <w:sz w:val="30"/>
         </w:rPr>
-        <w:t>2. Hóa Đơn &amp; Thanh Toán Trực Tuyến</w:t>
+        <w:t>2. Giao Diện Cổng Cư Dân Tổng Quan</w:t>
+      </w:r>
+    </w:p>
+    <w:p>
+      <w:pPr>
+        <w:spacing w:after="120" w:line="276" w:lineRule="auto"/>
+      </w:pPr>
+      <w:r>
+        <w:rPr>
+          <w:rFonts w:ascii="Be Vietnam Pro" w:hAnsi="Be Vietnam Pro"/>
+          <w:i w:val="0"/>
+          <w:color w:val="17231F"/>
+          <w:sz w:val="22"/>
+        </w:rPr>
+        <w:t>Sau khi chọn căn hộ, cư dân vào trang chủ Dashboard tổng hợp thông báo, tin tức và truy cập nhanh các dịch vụ:</w:t>
+      </w:r>
+    </w:p>
+    <w:p>
+      <w:pPr>
+        <w:spacing w:before="160" w:after="80"/>
+        <w:jc w:val="center"/>
+      </w:pPr>
+      <w:r>
+        <w:drawing>
+          <wp:inline xmlns:a="http://schemas.openxmlformats.org/drawingml/2006/main" xmlns:pic="http://schemas.openxmlformats.org/drawingml/2006/picture">
+            <wp:extent cx="5029200" cy="3352800"/>
+            <wp:docPr id="15" name="Picture 15"/>
+            <wp:cNvGraphicFramePr>
+              <a:graphicFrameLocks noChangeAspect="1"/>
+            </wp:cNvGraphicFramePr>
+            <a:graphic>
+              <a:graphicData uri="http://schemas.openxmlformats.org/drawingml/2006/picture">
+                <pic:pic>
+                  <pic:nvPicPr>
+                    <pic:cNvPr id="0" name="03-resident-tongquan.png"/>
+                    <pic:cNvPicPr/>
+                  </pic:nvPicPr>
+                  <pic:blipFill>
+                    <a:blip r:embed="rId23"/>
+                    <a:stretch>
+                      <a:fillRect/>
+                    </a:stretch>
+                  </pic:blipFill>
+                  <pic:spPr>
+                    <a:xfrm>
+                      <a:off x="0" y="0"/>
+                      <a:ext cx="5029200" cy="3352800"/>
+                    </a:xfrm>
+                    <a:prstGeom prst="rect"/>
+                  </pic:spPr>
+                </pic:pic>
+              </a:graphicData>
+            </a:graphic>
+          </wp:inline>
+        </w:drawing>
+      </w:r>
+    </w:p>
+    <w:p>
+      <w:pPr>
+        <w:spacing w:after="240"/>
+        <w:jc w:val="center"/>
+      </w:pPr>
+      <w:r>
+        <w:rPr>
+          <w:rFonts w:ascii="Be Vietnam Pro" w:hAnsi="Be Vietnam Pro"/>
+          <w:i/>
+          <w:color w:val="6E6FDF"/>
+          <w:sz w:val="19"/>
+        </w:rPr>
+        <w:t>Hình 3.2 — Dashboard trang chủ Cổng thông tin cư dân</w:t>
+      </w:r>
+    </w:p>
+    <w:p>
+      <w:pPr>
+        <w:keepNext/>
+        <w:spacing w:before="240" w:after="120"/>
+      </w:pPr>
+      <w:r>
+        <w:rPr>
+          <w:rFonts w:ascii="Playfair Display" w:hAnsi="Playfair Display"/>
+          <w:b/>
+          <w:color w:val="3E6E64"/>
+          <w:sz w:val="30"/>
+        </w:rPr>
+        <w:t>3. Hóa Đơn &amp; Thanh Toán Trực Tuyến</w:t>
       </w:r>
     </w:p>
     <w:p>
@@ -1445,30 +2154,62 @@
           <w:color w:val="17231F"/>
           <w:sz w:val="22"/>
         </w:rPr>
-        <w:t>Chi tiết hóa đơn: Xem lịch sử hóa đơn dịch vụ, hóa đơn điện nước chi tiết của từng tháng.</w:t>
+        <w:t>VietQR động: Nhấp Thanh toán để hệ thống tự sinh mã QR chứa đầy đủ số tiền và cú pháp chuyển khoản chính xác tuyệt đối. Cư dân quét mã qua ứng dụng ngân hàng để hoàn tất nộp phí tức thì.</w:t>
       </w:r>
     </w:p>
     <w:p>
       <w:pPr>
-        <w:spacing w:after="120" w:line="276" w:lineRule="auto"/>
+        <w:spacing w:before="160" w:after="80"/>
+        <w:jc w:val="center"/>
+      </w:pPr>
+      <w:r>
+        <w:drawing>
+          <wp:inline xmlns:a="http://schemas.openxmlformats.org/drawingml/2006/main" xmlns:pic="http://schemas.openxmlformats.org/drawingml/2006/picture">
+            <wp:extent cx="5029200" cy="3352800"/>
+            <wp:docPr id="16" name="Picture 16"/>
+            <wp:cNvGraphicFramePr>
+              <a:graphicFrameLocks noChangeAspect="1"/>
+            </wp:cNvGraphicFramePr>
+            <a:graphic>
+              <a:graphicData uri="http://schemas.openxmlformats.org/drawingml/2006/picture">
+                <pic:pic>
+                  <pic:nvPicPr>
+                    <pic:cNvPr id="0" name="04-res-HanTngHp.png"/>
+                    <pic:cNvPicPr/>
+                  </pic:nvPicPr>
+                  <pic:blipFill>
+                    <a:blip r:embed="rId24"/>
+                    <a:stretch>
+                      <a:fillRect/>
+                    </a:stretch>
+                  </pic:blipFill>
+                  <pic:spPr>
+                    <a:xfrm>
+                      <a:off x="0" y="0"/>
+                      <a:ext cx="5029200" cy="3352800"/>
+                    </a:xfrm>
+                    <a:prstGeom prst="rect"/>
+                  </pic:spPr>
+                </pic:pic>
+              </a:graphicData>
+            </a:graphic>
+          </wp:inline>
+        </w:drawing>
+      </w:r>
+    </w:p>
+    <w:p>
+      <w:pPr>
+        <w:spacing w:after="240"/>
+        <w:jc w:val="center"/>
       </w:pPr>
       <w:r>
         <w:rPr>
           <w:rFonts w:ascii="Be Vietnam Pro" w:hAnsi="Be Vietnam Pro"/>
-          <w:b/>
-          <w:color w:val="17231F"/>
-          <w:sz w:val="22"/>
+          <w:i/>
+          <w:color w:val="6E6FDF"/>
+          <w:sz w:val="19"/>
         </w:rPr>
-        <w:t xml:space="preserve">• </w:t>
-      </w:r>
-      <w:r>
-        <w:rPr>
-          <w:rFonts w:ascii="Be Vietnam Pro" w:hAnsi="Be Vietnam Pro"/>
-          <w:i w:val="0"/>
-          <w:color w:val="17231F"/>
-          <w:sz w:val="22"/>
-        </w:rPr>
-        <w:t>VietQR động: Nhấp Thanh toán để hệ thống tự sinh mã QR chứa đầy đủ số tiền và cú pháp chuyển khoản chính xác tuyệt đối. Cư dân quét mã qua ứng dụng ngân hàng để hoàn tất nộp phí tức thì.</w:t>
+        <w:t>Hình 3.3 — Trang xem hóa đơn tổng hợp của cư dân</w:t>
       </w:r>
     </w:p>
     <w:p>
@@ -1483,7 +2224,7 @@
           <w:color w:val="3E6E64"/>
           <w:sz w:val="30"/>
         </w:rPr>
-        <w:t>3. Đặt Lịch Tiện Ích Tự Phục Vụ (Amenity Booking)</w:t>
+        <w:t>4. Đặt Lịch Tiện Ích Tự Phục Vụ (Amenity Booking)</w:t>
       </w:r>
     </w:p>
     <w:p>
@@ -1525,25 +2266,57 @@
     </w:p>
     <w:p>
       <w:pPr>
-        <w:spacing w:after="120" w:line="276" w:lineRule="auto"/>
+        <w:spacing w:before="160" w:after="80"/>
+        <w:jc w:val="center"/>
+      </w:pPr>
+      <w:r>
+        <w:drawing>
+          <wp:inline xmlns:a="http://schemas.openxmlformats.org/drawingml/2006/main" xmlns:pic="http://schemas.openxmlformats.org/drawingml/2006/picture">
+            <wp:extent cx="5029200" cy="3352800"/>
+            <wp:docPr id="17" name="Picture 17"/>
+            <wp:cNvGraphicFramePr>
+              <a:graphicFrameLocks noChangeAspect="1"/>
+            </wp:cNvGraphicFramePr>
+            <a:graphic>
+              <a:graphicData uri="http://schemas.openxmlformats.org/drawingml/2006/picture">
+                <pic:pic>
+                  <pic:nvPicPr>
+                    <pic:cNvPr id="0" name="05-res-ngKTinch.png"/>
+                    <pic:cNvPicPr/>
+                  </pic:nvPicPr>
+                  <pic:blipFill>
+                    <a:blip r:embed="rId25"/>
+                    <a:stretch>
+                      <a:fillRect/>
+                    </a:stretch>
+                  </pic:blipFill>
+                  <pic:spPr>
+                    <a:xfrm>
+                      <a:off x="0" y="0"/>
+                      <a:ext cx="5029200" cy="3352800"/>
+                    </a:xfrm>
+                    <a:prstGeom prst="rect"/>
+                  </pic:spPr>
+                </pic:pic>
+              </a:graphicData>
+            </a:graphic>
+          </wp:inline>
+        </w:drawing>
+      </w:r>
+    </w:p>
+    <w:p>
+      <w:pPr>
+        <w:spacing w:after="240"/>
+        <w:jc w:val="center"/>
       </w:pPr>
       <w:r>
         <w:rPr>
           <w:rFonts w:ascii="Be Vietnam Pro" w:hAnsi="Be Vietnam Pro"/>
-          <w:b/>
-          <w:color w:val="17231F"/>
-          <w:sz w:val="22"/>
+          <w:i/>
+          <w:color w:val="6E6FDF"/>
+          <w:sz w:val="19"/>
         </w:rPr>
-        <w:t xml:space="preserve">• </w:t>
-      </w:r>
-      <w:r>
-        <w:rPr>
-          <w:rFonts w:ascii="Be Vietnam Pro" w:hAnsi="Be Vietnam Pro"/>
-          <w:i w:val="0"/>
-          <w:color w:val="17231F"/>
-          <w:sz w:val="22"/>
-        </w:rPr>
-        <w:t>Thông báo nhắc nhở tự động: Hệ thống kích hoạt cron job gửi Web Push thông báo nhắc cư dân trước giờ bắt đầu 20 phút (chuẩn bị trải nghiệm) và trước giờ kết thúc 15 phút (chuẩn bị thu dọn tư trang).</w:t>
+        <w:t>Hình 3.4 — Giao diện tự đặt lịch dịch vụ của cư dân</w:t>
       </w:r>
     </w:p>
     <w:p>
@@ -1558,7 +2331,7 @@
           <w:color w:val="3E6E64"/>
           <w:sz w:val="30"/>
         </w:rPr>
-        <w:t>4. Gửi Phản Ánh &amp; Ý Kiến Đóng Góp</w:t>
+        <w:t>5. Gửi Phản Ánh &amp; Ý Kiến Đóng Góp</w:t>
       </w:r>
     </w:p>
     <w:p>
@@ -1600,6 +2373,90 @@
     </w:p>
     <w:p>
       <w:pPr>
+        <w:spacing w:before="160" w:after="80"/>
+        <w:jc w:val="center"/>
+      </w:pPr>
+      <w:r>
+        <w:drawing>
+          <wp:inline xmlns:a="http://schemas.openxmlformats.org/drawingml/2006/main" xmlns:pic="http://schemas.openxmlformats.org/drawingml/2006/picture">
+            <wp:extent cx="5029200" cy="3352800"/>
+            <wp:docPr id="18" name="Picture 18"/>
+            <wp:cNvGraphicFramePr>
+              <a:graphicFrameLocks noChangeAspect="1"/>
+            </wp:cNvGraphicFramePr>
+            <a:graphic>
+              <a:graphicData uri="http://schemas.openxmlformats.org/drawingml/2006/picture">
+                <pic:pic>
+                  <pic:nvPicPr>
+                    <pic:cNvPr id="0" name="05-res-Phnnh.png"/>
+                    <pic:cNvPicPr/>
+                  </pic:nvPicPr>
+                  <pic:blipFill>
+                    <a:blip r:embed="rId26"/>
+                    <a:stretch>
+                      <a:fillRect/>
+                    </a:stretch>
+                  </pic:blipFill>
+                  <pic:spPr>
+                    <a:xfrm>
+                      <a:off x="0" y="0"/>
+                      <a:ext cx="5029200" cy="3352800"/>
+                    </a:xfrm>
+                    <a:prstGeom prst="rect"/>
+                  </pic:spPr>
+                </pic:pic>
+              </a:graphicData>
+            </a:graphic>
+          </wp:inline>
+        </w:drawing>
+      </w:r>
+    </w:p>
+    <w:p>
+      <w:pPr>
+        <w:spacing w:after="240"/>
+        <w:jc w:val="center"/>
+      </w:pPr>
+      <w:r>
+        <w:rPr>
+          <w:rFonts w:ascii="Be Vietnam Pro" w:hAnsi="Be Vietnam Pro"/>
+          <w:i/>
+          <w:color w:val="6E6FDF"/>
+          <w:sz w:val="19"/>
+        </w:rPr>
+        <w:t>Hình 3.5 — Lịch sử gửi phản ánh và tiến độ giải quyết</w:t>
+      </w:r>
+    </w:p>
+    <w:p>
+      <w:pPr>
+        <w:keepNext/>
+        <w:spacing w:before="240" w:after="120"/>
+      </w:pPr>
+      <w:r>
+        <w:rPr>
+          <w:rFonts w:ascii="Playfair Display" w:hAnsi="Playfair Display"/>
+          <w:b/>
+          <w:color w:val="3E6E64"/>
+          <w:sz w:val="30"/>
+        </w:rPr>
+        <w:t>6. Đăng Ký Thẻ Xe &amp; Cải Tạo Sửa Chữa</w:t>
+      </w:r>
+    </w:p>
+    <w:p>
+      <w:pPr>
+        <w:spacing w:after="120" w:line="276" w:lineRule="auto"/>
+      </w:pPr>
+      <w:r>
+        <w:rPr>
+          <w:rFonts w:ascii="Be Vietnam Pro" w:hAnsi="Be Vietnam Pro"/>
+          <w:i w:val="0"/>
+          <w:color w:val="17231F"/>
+          <w:sz w:val="22"/>
+        </w:rPr>
+        <w:t>Các dịch vụ đăng ký điện tử khác:</w:t>
+      </w:r>
+    </w:p>
+    <w:p>
+      <w:pPr>
         <w:spacing w:after="120" w:line="276" w:lineRule="auto"/>
       </w:pPr>
       <w:r>
@@ -1618,7 +2475,140 @@
           <w:color w:val="17231F"/>
           <w:sz w:val="22"/>
         </w:rPr>
-        <w:t>Theo dõi tiến độ: Theo dõi trực quan trạng thái ticket từ Tiếp nhận -&gt; Đang xử lý -&gt; Đã giải quyết kèm phản hồi từ nhân viên.</w:t>
+        <w:t>Thẻ xe: Cư dân khai báo biển số và tải ảnh giấy tờ xe trực tuyến.</w:t>
+      </w:r>
+    </w:p>
+    <w:p>
+      <w:pPr>
+        <w:spacing w:before="160" w:after="80"/>
+        <w:jc w:val="center"/>
+      </w:pPr>
+      <w:r>
+        <w:drawing>
+          <wp:inline xmlns:a="http://schemas.openxmlformats.org/drawingml/2006/main" xmlns:pic="http://schemas.openxmlformats.org/drawingml/2006/picture">
+            <wp:extent cx="5029200" cy="3352800"/>
+            <wp:docPr id="19" name="Picture 19"/>
+            <wp:cNvGraphicFramePr>
+              <a:graphicFrameLocks noChangeAspect="1"/>
+            </wp:cNvGraphicFramePr>
+            <a:graphic>
+              <a:graphicData uri="http://schemas.openxmlformats.org/drawingml/2006/picture">
+                <pic:pic>
+                  <pic:nvPicPr>
+                    <pic:cNvPr id="0" name="05-res-ThXePhngTin.png"/>
+                    <pic:cNvPicPr/>
+                  </pic:nvPicPr>
+                  <pic:blipFill>
+                    <a:blip r:embed="rId27"/>
+                    <a:stretch>
+                      <a:fillRect/>
+                    </a:stretch>
+                  </pic:blipFill>
+                  <pic:spPr>
+                    <a:xfrm>
+                      <a:off x="0" y="0"/>
+                      <a:ext cx="5029200" cy="3352800"/>
+                    </a:xfrm>
+                    <a:prstGeom prst="rect"/>
+                  </pic:spPr>
+                </pic:pic>
+              </a:graphicData>
+            </a:graphic>
+          </wp:inline>
+        </w:drawing>
+      </w:r>
+    </w:p>
+    <w:p>
+      <w:pPr>
+        <w:spacing w:after="240"/>
+        <w:jc w:val="center"/>
+      </w:pPr>
+      <w:r>
+        <w:rPr>
+          <w:rFonts w:ascii="Be Vietnam Pro" w:hAnsi="Be Vietnam Pro"/>
+          <w:i/>
+          <w:color w:val="6E6FDF"/>
+          <w:sz w:val="19"/>
+        </w:rPr>
+        <w:t>Hình 3.6 — Đăng ký thẻ xe phương tiện cư dân</w:t>
+      </w:r>
+    </w:p>
+    <w:p>
+      <w:pPr>
+        <w:spacing w:after="120" w:line="276" w:lineRule="auto"/>
+      </w:pPr>
+      <w:r>
+        <w:rPr>
+          <w:rFonts w:ascii="Be Vietnam Pro" w:hAnsi="Be Vietnam Pro"/>
+          <w:b/>
+          <w:color w:val="17231F"/>
+          <w:sz w:val="22"/>
+        </w:rPr>
+        <w:t xml:space="preserve">• </w:t>
+      </w:r>
+      <w:r>
+        <w:rPr>
+          <w:rFonts w:ascii="Be Vietnam Pro" w:hAnsi="Be Vietnam Pro"/>
+          <w:i w:val="0"/>
+          <w:color w:val="17231F"/>
+          <w:sz w:val="22"/>
+        </w:rPr>
+        <w:t>Đăng ký thi công: Gửi hồ sơ sửa chữa, hoàn thiện căn hộ.</w:t>
+      </w:r>
+    </w:p>
+    <w:p>
+      <w:pPr>
+        <w:spacing w:before="160" w:after="80"/>
+        <w:jc w:val="center"/>
+      </w:pPr>
+      <w:r>
+        <w:drawing>
+          <wp:inline xmlns:a="http://schemas.openxmlformats.org/drawingml/2006/main" xmlns:pic="http://schemas.openxmlformats.org/drawingml/2006/picture">
+            <wp:extent cx="5029200" cy="3352800"/>
+            <wp:docPr id="20" name="Picture 20"/>
+            <wp:cNvGraphicFramePr>
+              <a:graphicFrameLocks noChangeAspect="1"/>
+            </wp:cNvGraphicFramePr>
+            <a:graphic>
+              <a:graphicData uri="http://schemas.openxmlformats.org/drawingml/2006/picture">
+                <pic:pic>
+                  <pic:nvPicPr>
+                    <pic:cNvPr id="0" name="05-res-ngKCiTo.png"/>
+                    <pic:cNvPicPr/>
+                  </pic:nvPicPr>
+                  <pic:blipFill>
+                    <a:blip r:embed="rId28"/>
+                    <a:stretch>
+                      <a:fillRect/>
+                    </a:stretch>
+                  </pic:blipFill>
+                  <pic:spPr>
+                    <a:xfrm>
+                      <a:off x="0" y="0"/>
+                      <a:ext cx="5029200" cy="3352800"/>
+                    </a:xfrm>
+                    <a:prstGeom prst="rect"/>
+                  </pic:spPr>
+                </pic:pic>
+              </a:graphicData>
+            </a:graphic>
+          </wp:inline>
+        </w:drawing>
+      </w:r>
+    </w:p>
+    <w:p>
+      <w:pPr>
+        <w:spacing w:after="240"/>
+        <w:jc w:val="center"/>
+      </w:pPr>
+      <w:r>
+        <w:rPr>
+          <w:rFonts w:ascii="Be Vietnam Pro" w:hAnsi="Be Vietnam Pro"/>
+          <w:i/>
+          <w:color w:val="6E6FDF"/>
+          <w:sz w:val="19"/>
+        </w:rPr>
+        <w:t>Hình 3.7 — Đăng ký sửa chữa cải tạo và đặt cọc thi công</w:t>
       </w:r>
     </w:p>
     <w:sectPr>

</xml_diff>

<commit_message>
docs: expand USER_GUIDE v1.6 with detailed CRM pages and workflows
</commit_message>
<xml_diff>
--- a/USER_GUIDE_v1.6.docx
+++ b/USER_GUIDE_v1.6.docx
@@ -1721,7 +1721,7 @@
           <w:color w:val="3E6E64"/>
           <w:sz w:val="30"/>
         </w:rPr>
-        <w:t>8. Phân Hệ Kinh Doanh &amp; CRM (Sales &amp; Contract Lifecycle)</w:t>
+        <w:t>8. Hướng Dẫn Chi Tiết Các Hạng Mục Phân Hệ Kinh Doanh (CRM &amp; Sales)</w:t>
       </w:r>
     </w:p>
     <w:p>
@@ -1735,30 +1735,7 @@
           <w:color w:val="17231F"/>
           <w:sz w:val="22"/>
         </w:rPr>
-        <w:t>Quy trình bán hàng khép kín từ Lead đến HĐMB:</w:t>
-      </w:r>
-    </w:p>
-    <w:p>
-      <w:pPr>
-        <w:spacing w:after="120" w:line="276" w:lineRule="auto"/>
-      </w:pPr>
-      <w:r>
-        <w:rPr>
-          <w:rFonts w:ascii="Be Vietnam Pro" w:hAnsi="Be Vietnam Pro"/>
-          <w:b/>
-          <w:color w:val="17231F"/>
-          <w:sz w:val="22"/>
-        </w:rPr>
-        <w:t xml:space="preserve">• </w:t>
-      </w:r>
-      <w:r>
-        <w:rPr>
-          <w:rFonts w:ascii="Be Vietnam Pro" w:hAnsi="Be Vietnam Pro"/>
-          <w:i w:val="0"/>
-          <w:color w:val="17231F"/>
-          <w:sz w:val="22"/>
-        </w:rPr>
-        <w:t>Sales Matrix: Bản đồ giỏ hàng bất động sản theo thời gian thực (Trống, Đã giữ chỗ, Đã cọc, Đã ký HĐMB).</w:t>
+        <w:t>Dưới đây là mô tả chi tiết từng trang và quy trình hoạt động (workflow) của phân hệ Kinh doanh &amp; CRM bất động sản:</w:t>
       </w:r>
     </w:p>
     <w:p>
@@ -1813,7 +1790,306 @@
           <w:color w:val="6E6FDF"/>
           <w:sz w:val="19"/>
         </w:rPr>
-        <w:t>Hình 2.10 — Phân hệ quản lý bán hàng CRM</w:t>
+        <w:t>Hình 2.10 — Phân hệ quản lý bán hàng CRM tổng quan</w:t>
+      </w:r>
+    </w:p>
+    <w:p>
+      <w:pPr>
+        <w:spacing w:after="120" w:line="276" w:lineRule="auto"/>
+      </w:pPr>
+      <w:r>
+        <w:rPr>
+          <w:rFonts w:ascii="Be Vietnam Pro" w:hAnsi="Be Vietnam Pro"/>
+          <w:b/>
+          <w:color w:val="17231F"/>
+          <w:sz w:val="22"/>
+        </w:rPr>
+        <w:t xml:space="preserve">8.1. Trang Dashboard CRM: </w:t>
+      </w:r>
+      <w:r>
+        <w:rPr>
+          <w:rFonts w:ascii="Be Vietnam Pro" w:hAnsi="Be Vietnam Pro"/>
+          <w:i w:val="0"/>
+          <w:color w:val="17231F"/>
+          <w:sz w:val="22"/>
+        </w:rPr>
+        <w:t>CRM Dashboard: Nơi cung cấp bức tranh toàn cảnh về hiệu suất kinh doanh bao gồm: Tổng giá trị cơ hội, Doanh số thực tế, Tỷ lệ chuyển đổi lead và Tổng hoa hồng phát sinh.</w:t>
+      </w:r>
+    </w:p>
+    <w:p>
+      <w:pPr>
+        <w:spacing w:after="120" w:line="276" w:lineRule="auto"/>
+      </w:pPr>
+      <w:r>
+        <w:rPr>
+          <w:rFonts w:ascii="Be Vietnam Pro" w:hAnsi="Be Vietnam Pro"/>
+          <w:b/>
+          <w:color w:val="17231F"/>
+          <w:sz w:val="22"/>
+        </w:rPr>
+        <w:t xml:space="preserve">8.2. Trang Sales Matrix: </w:t>
+      </w:r>
+      <w:r>
+        <w:rPr>
+          <w:rFonts w:ascii="Be Vietnam Pro" w:hAnsi="Be Vietnam Pro"/>
+          <w:i w:val="0"/>
+          <w:color w:val="17231F"/>
+          <w:sz w:val="22"/>
+        </w:rPr>
+        <w:t>Sales Matrix (Bản Đồ Giỏ Hàng): Hiển thị trực quan mặt bằng giỏ hàng bất động sản theo thời gian thực. Mỗi căn hộ trong khối đế (CANTATA, TESLA...) được tô màu theo trạng thái: Màu Trắng (Trống), Màu Vàng (Đang giữ chỗ - Booking), Màu Cam (Đã đặt cọc - Deposit), Màu Xanh (Đã ký HĐMB - Contract Signed).</w:t>
+      </w:r>
+    </w:p>
+    <w:p>
+      <w:pPr>
+        <w:spacing w:after="120" w:line="276" w:lineRule="auto"/>
+      </w:pPr>
+      <w:r>
+        <w:rPr>
+          <w:rFonts w:ascii="Be Vietnam Pro" w:hAnsi="Be Vietnam Pro"/>
+          <w:b/>
+          <w:color w:val="17231F"/>
+          <w:sz w:val="22"/>
+        </w:rPr>
+        <w:t xml:space="preserve">8.3. Trang Quản lý Sản Phẩm (Inventory): </w:t>
+      </w:r>
+      <w:r>
+        <w:rPr>
+          <w:rFonts w:ascii="Be Vietnam Pro" w:hAnsi="Be Vietnam Pro"/>
+          <w:i w:val="0"/>
+          <w:color w:val="17231F"/>
+          <w:sz w:val="22"/>
+        </w:rPr>
+        <w:t>Product Inventory: Quản lý chi tiết cơ sở dữ liệu sản phẩm, phân khu, loại hình bất động sản, diện tích, đơn giá cơ bản và thông số kỹ thuật căn hộ.</w:t>
+      </w:r>
+    </w:p>
+    <w:p>
+      <w:pPr>
+        <w:spacing w:after="120" w:line="276" w:lineRule="auto"/>
+      </w:pPr>
+      <w:r>
+        <w:rPr>
+          <w:rFonts w:ascii="Be Vietnam Pro" w:hAnsi="Be Vietnam Pro"/>
+          <w:b/>
+          <w:color w:val="17231F"/>
+          <w:sz w:val="22"/>
+        </w:rPr>
+        <w:t xml:space="preserve">8.4. Trang Lead Kanban: </w:t>
+      </w:r>
+      <w:r>
+        <w:rPr>
+          <w:rFonts w:ascii="Be Vietnam Pro" w:hAnsi="Be Vietnam Pro"/>
+          <w:i w:val="0"/>
+          <w:color w:val="17231F"/>
+          <w:sz w:val="22"/>
+        </w:rPr>
+        <w:t>Lead Kanban Page: Quản lý khách hàng tiềm năng bằng bảng Kanban đa giai đoạn (Mới, Đang liên hệ, Quan tâm, Đặt chỗ, Chốt hợp đồng). Nhân viên Sales có thể dễ dàng kéo thả Lead qua các cột trạng thái.</w:t>
+      </w:r>
+    </w:p>
+    <w:p>
+      <w:pPr>
+        <w:spacing w:after="120" w:line="276" w:lineRule="auto"/>
+      </w:pPr>
+      <w:r>
+        <w:rPr>
+          <w:rFonts w:ascii="Be Vietnam Pro" w:hAnsi="Be Vietnam Pro"/>
+          <w:b/>
+          <w:color w:val="17231F"/>
+          <w:sz w:val="22"/>
+        </w:rPr>
+        <w:t xml:space="preserve">8.5. Trang Giỏ Hàng &amp; Giữ Chỗ (Cart &amp; Booking): </w:t>
+      </w:r>
+      <w:r>
+        <w:rPr>
+          <w:rFonts w:ascii="Be Vietnam Pro" w:hAnsi="Be Vietnam Pro"/>
+          <w:i w:val="0"/>
+          <w:color w:val="17231F"/>
+          <w:sz w:val="22"/>
+        </w:rPr>
+        <w:t>Cart &amp; Booking: Nhân viên kinh doanh chọn căn hộ còn trống từ giỏ hàng, gán thông tin Lead và tiến hành đặt giữ chỗ (Booking) có thời hạn (thời gian giữ chỗ chuẩn là 24 giờ).</w:t>
+      </w:r>
+    </w:p>
+    <w:p>
+      <w:pPr>
+        <w:spacing w:after="120" w:line="276" w:lineRule="auto"/>
+      </w:pPr>
+      <w:r>
+        <w:rPr>
+          <w:rFonts w:ascii="Be Vietnam Pro" w:hAnsi="Be Vietnam Pro"/>
+          <w:b/>
+          <w:color w:val="17231F"/>
+          <w:sz w:val="22"/>
+        </w:rPr>
+        <w:t xml:space="preserve">8.6. Trang Danh Sách Phiếu Đặt Cọc: </w:t>
+      </w:r>
+      <w:r>
+        <w:rPr>
+          <w:rFonts w:ascii="Be Vietnam Pro" w:hAnsi="Be Vietnam Pro"/>
+          <w:i w:val="0"/>
+          <w:color w:val="17231F"/>
+          <w:sz w:val="22"/>
+        </w:rPr>
+        <w:t>Deposit List: Danh sách quản lý các Phiếu thu Đặt cọc (PDC Receipts) có kèm kiểm soát đối soát kế toán bán hàng (ACC-S) để xác nhận chuyển khoản đặt cọc thực tế của khách hàng.</w:t>
+      </w:r>
+    </w:p>
+    <w:p>
+      <w:pPr>
+        <w:spacing w:after="120" w:line="276" w:lineRule="auto"/>
+      </w:pPr>
+      <w:r>
+        <w:rPr>
+          <w:rFonts w:ascii="Be Vietnam Pro" w:hAnsi="Be Vietnam Pro"/>
+          <w:b/>
+          <w:color w:val="17231F"/>
+          <w:sz w:val="22"/>
+        </w:rPr>
+        <w:t xml:space="preserve">8.7. Trang Danh Sách &amp; Chi Tiết Hợp Đồng (Contract List): </w:t>
+      </w:r>
+      <w:r>
+        <w:rPr>
+          <w:rFonts w:ascii="Be Vietnam Pro" w:hAnsi="Be Vietnam Pro"/>
+          <w:i w:val="0"/>
+          <w:color w:val="17231F"/>
+          <w:sz w:val="22"/>
+        </w:rPr>
+        <w:t>Contract List &amp; Details: Quản lý vòng đời hợp đồng. Chi tiết hợp đồng hiển thị tiến độ đóng tiền, lịch sử các đợt thanh toán (10 đợt chuẩn), tệp đính kèm HĐ scan, và các phụ lục pháp lý liên quan.</w:t>
+      </w:r>
+    </w:p>
+    <w:p>
+      <w:pPr>
+        <w:spacing w:after="120" w:line="276" w:lineRule="auto"/>
+      </w:pPr>
+      <w:r>
+        <w:rPr>
+          <w:rFonts w:ascii="Be Vietnam Pro" w:hAnsi="Be Vietnam Pro"/>
+          <w:b/>
+          <w:color w:val="17231F"/>
+          <w:sz w:val="22"/>
+        </w:rPr>
+        <w:t xml:space="preserve">8.8. Trang Quản Lý Công Nợ Quá Hạn: </w:t>
+      </w:r>
+      <w:r>
+        <w:rPr>
+          <w:rFonts w:ascii="Be Vietnam Pro" w:hAnsi="Be Vietnam Pro"/>
+          <w:i w:val="0"/>
+          <w:color w:val="17231F"/>
+          <w:sz w:val="22"/>
+        </w:rPr>
+        <w:t>Overdue Payments Tracker: Giám sát tuổi nợ thanh toán đợt đóng tiền của HĐMB, tự động kích hoạt gửi thông báo nhắc nợ khi đến hạn.</w:t>
+      </w:r>
+    </w:p>
+    <w:p>
+      <w:pPr>
+        <w:spacing w:after="120" w:line="276" w:lineRule="auto"/>
+      </w:pPr>
+      <w:r>
+        <w:rPr>
+          <w:rFonts w:ascii="Be Vietnam Pro" w:hAnsi="Be Vietnam Pro"/>
+          <w:b/>
+          <w:color w:val="17231F"/>
+          <w:sz w:val="22"/>
+        </w:rPr>
+        <w:t xml:space="preserve">8.9. Trang Hàng Đợi Phê Duyệt: </w:t>
+      </w:r>
+      <w:r>
+        <w:rPr>
+          <w:rFonts w:ascii="Be Vietnam Pro" w:hAnsi="Be Vietnam Pro"/>
+          <w:i w:val="0"/>
+          <w:color w:val="17231F"/>
+          <w:sz w:val="22"/>
+        </w:rPr>
+        <w:t>Approval Queue: Hàng đợi phê duyệt phân bổ lead, chiết khấu đặc biệt vượt hạn mức, và hồ sơ chuyển nhượng HĐMB gửi lên cấp quản lý (SHEAD / SM / DIR).</w:t>
+      </w:r>
+    </w:p>
+    <w:p>
+      <w:pPr>
+        <w:spacing w:after="120" w:line="276" w:lineRule="auto"/>
+      </w:pPr>
+      <w:r>
+        <w:rPr>
+          <w:rFonts w:ascii="Be Vietnam Pro" w:hAnsi="Be Vietnam Pro"/>
+          <w:b/>
+          <w:color w:val="17231F"/>
+          <w:sz w:val="22"/>
+        </w:rPr>
+        <w:t xml:space="preserve">8.10. Trang Chính Sách Giá &amp; Ưu Đãi: </w:t>
+      </w:r>
+      <w:r>
+        <w:rPr>
+          <w:rFonts w:ascii="Be Vietnam Pro" w:hAnsi="Be Vietnam Pro"/>
+          <w:i w:val="0"/>
+          <w:color w:val="17231F"/>
+          <w:sz w:val="22"/>
+        </w:rPr>
+        <w:t>Pricing Policy (Pricebooks): Thiết lập biểu giá cơ bản, các chính sách ưu đãi chiết khấu thanh toán sớm, và chiến dịch bán hàng áp dụng cho từng đợt mở bán.</w:t>
+      </w:r>
+    </w:p>
+    <w:p>
+      <w:pPr>
+        <w:spacing w:after="120" w:line="276" w:lineRule="auto"/>
+      </w:pPr>
+      <w:r>
+        <w:rPr>
+          <w:rFonts w:ascii="Be Vietnam Pro" w:hAnsi="Be Vietnam Pro"/>
+          <w:b/>
+          <w:color w:val="17231F"/>
+          <w:sz w:val="22"/>
+        </w:rPr>
+        <w:t xml:space="preserve">8.11. Trang Quản Lý Hoa Hồng: </w:t>
+      </w:r>
+      <w:r>
+        <w:rPr>
+          <w:rFonts w:ascii="Be Vietnam Pro" w:hAnsi="Be Vietnam Pro"/>
+          <w:i w:val="0"/>
+          <w:color w:val="17231F"/>
+          <w:sz w:val="22"/>
+        </w:rPr>
+        <w:t>Commission Page: Tự động tính toán hoa hồng cho nhân viên kinh doanh (Sales) và Đại lý/Kênh phân phối (Broker Agent) dựa trên phần trăm chiết khấu hợp đồng thực tế đã tất toán.</w:t>
+      </w:r>
+    </w:p>
+    <w:p>
+      <w:pPr>
+        <w:spacing w:after="120" w:line="276" w:lineRule="auto"/>
+      </w:pPr>
+      <w:r>
+        <w:rPr>
+          <w:rFonts w:ascii="Be Vietnam Pro" w:hAnsi="Be Vietnam Pro"/>
+          <w:b/>
+          <w:color w:val="17231F"/>
+          <w:sz w:val="22"/>
+        </w:rPr>
+        <w:t xml:space="preserve">8.12. Trang Chuyển Nhượng Hợp Đồng: </w:t>
+      </w:r>
+      <w:r>
+        <w:rPr>
+          <w:rFonts w:ascii="Be Vietnam Pro" w:hAnsi="Be Vietnam Pro"/>
+          <w:i w:val="0"/>
+          <w:color w:val="17231F"/>
+          <w:sz w:val="22"/>
+        </w:rPr>
+        <w:t>Property Transfer (B.7): Quản lý hồ sơ chuyển nhượng HĐMB từ khách hàng cũ sang khách hàng mới, kiểm tra điều kiện rà soát quá hạn, tự động tính thuế phí, và kế thừa nguyên vẹn 100% lịch thanh toán gốc.</w:t>
+      </w:r>
+    </w:p>
+    <w:p>
+      <w:pPr>
+        <w:spacing w:after="120" w:line="276" w:lineRule="auto"/>
+      </w:pPr>
+      <w:r>
+        <w:rPr>
+          <w:rFonts w:ascii="Be Vietnam Pro" w:hAnsi="Be Vietnam Pro"/>
+          <w:b/>
+          <w:color w:val="17231F"/>
+          <w:sz w:val="22"/>
+        </w:rPr>
+        <w:t xml:space="preserve">8.13. Trang Quản Lý Bàn Giao: </w:t>
+      </w:r>
+      <w:r>
+        <w:rPr>
+          <w:rFonts w:ascii="Be Vietnam Pro" w:hAnsi="Be Vietnam Pro"/>
+          <w:i w:val="0"/>
+          <w:color w:val="17231F"/>
+          <w:sz w:val="22"/>
+        </w:rPr>
+        <w:t>Handover Management (PMO): Tổ chức quy trình bàn giao nhà thực tế. Cho phép Ban Quản Lý (PMO) quản lý biên bản kiểm tra kỹ thuật căn hộ, danh mục lỗi kỹ thuật phát sinh (Snag list), và chuyển giao căn hộ sang trạng thái Vận hành (Operations Bridge).</w:t>
       </w:r>
     </w:p>
     <w:p>

</xml_diff>